<commit_message>
Add Annex E: five guided acceptance examples to the implementation manual
E0 preparation (users, config, CSV import), E1 simple purchase end to end,
E2 comparative table with two budget lines, E3 CHB exceptions and blocking,
E4 service order with balance checks, reversals and cancellation,
E5 security, reception with penalty, cancellations, import errors and audit.
Practice CSV files in sic-muni/ejemplos. Form: clear C-31 lines after a rejected
emission to avoid duplicates on retry. Admin menu option 6 message updated.

Co-Authored-By: Claude Sonnet 5.5 <noreply@anthropic.com>
Claude-Session: https://claude.ai/code/session_01MYLY6nn23NgZLc9y6Vzcaj
</commit_message>
<xml_diff>
--- a/sic-muni/docs/MANUAL_USUARIO.docx
+++ b/sic-muni/docs/MANUAL_USUARIO.docx
@@ -259,6 +259,20 @@
           <w:szCs w:val="22"/>
         </w:rPr>
         <w:t xml:space="preserve">14. Tarjetas de consulta rápida</w:t>
+      </w:r>
+    </w:p>
+    <w:p>
+      <w:pPr>
+        <w:spacing w:after="60"/>
+        <w:ind w:left="360"/>
+      </w:pPr>
+      <w:r>
+        <w:rPr>
+          <w:rFonts w:ascii="Calibri" w:cs="Calibri" w:eastAsia="Calibri" w:hAnsi="Calibri"/>
+          <w:sz w:val="22"/>
+          <w:szCs w:val="22"/>
+        </w:rPr>
+        <w:t xml:space="preserve">15. Practique con casos de ejemplo</w:t>
       </w:r>
     </w:p>
     <w:p>
@@ -11660,6 +11674,56 @@
           <w:rFonts w:ascii="Calibri" w:cs="Calibri" w:eastAsia="Calibri" w:hAnsi="Calibri"/>
         </w:rPr>
         <w:t xml:space="preserve"> Menú: 1 usuarios · 2 desbloqueo · 3 contraseña · 4-5 importar · 6-7 configurar y proteger · 8 auditoría.</w:t>
+      </w:r>
+    </w:p>
+    <w:p>
+      <w:pPr>
+        <w:pStyle w:val="Heading1"/>
+      </w:pPr>
+      <w:r>
+        <w:rPr>
+          <w:rFonts w:ascii="Calibri" w:cs="Calibri" w:eastAsia="Calibri" w:hAnsi="Calibri"/>
+        </w:rPr>
+        <w:t xml:space="preserve">15. Practique con casos de ejemplo</w:t>
+      </w:r>
+    </w:p>
+    <w:p>
+      <w:pPr>
+        <w:spacing w:after="140"/>
+      </w:pPr>
+      <w:r>
+        <w:rPr>
+          <w:rFonts w:ascii="Calibri" w:cs="Calibri" w:eastAsia="Calibri" w:hAnsi="Calibri"/>
+        </w:rPr>
+        <w:t xml:space="preserve">Antes de usar el sistema con trámites reales, practique en una </w:t>
+      </w:r>
+      <w:r>
+        <w:rPr>
+          <w:rFonts w:ascii="Calibri" w:cs="Calibri" w:eastAsia="Calibri" w:hAnsi="Calibri"/>
+          <w:b/>
+          <w:bCs/>
+        </w:rPr>
+        <w:t xml:space="preserve">copia de ensayo</w:t>
+      </w:r>
+      <w:r>
+        <w:rPr>
+          <w:rFonts w:ascii="Calibri" w:cs="Calibri" w:eastAsia="Calibri" w:hAnsi="Calibri"/>
+        </w:rPr>
+        <w:t xml:space="preserve"> con los cinco ejemplos guiados del </w:t>
+      </w:r>
+      <w:r>
+        <w:rPr>
+          <w:rFonts w:ascii="Calibri" w:cs="Calibri" w:eastAsia="Calibri" w:hAnsi="Calibri"/>
+          <w:b/>
+          <w:bCs/>
+        </w:rPr>
+        <w:t xml:space="preserve">Anexo E del Manual de Implementación</w:t>
+      </w:r>
+      <w:r>
+        <w:rPr>
+          <w:rFonts w:ascii="Calibri" w:cs="Calibri" w:eastAsia="Calibri" w:hAnsi="Calibri"/>
+        </w:rPr>
+        <w:t xml:space="preserve"> (con usuarios, catálogo y presupuesto de práctica). Cubren: compra simple, contratación con cuadro comparativo, excepciones CHB, orden de servicio con reversiones y anulación, y recepción con multa.</w:t>
       </w:r>
     </w:p>
     <w:sectPr>

</xml_diff>

<commit_message>
Tie-break by first reception, colorful intuitive forms, manuals updated
- Cotizaciones: FechaHoraRecepcion (optional 'Recibida el') and Desempate columns;
  EvaluarCuadro resolves equal lowest price by earliest reception, logs
  CUADRO_DESEMPATE and the comparative-table PDF explains it.
- Forms: navy title bar, per-tab colored banners and tabs, section bars,
  color-coded buttons (blue/green/violet/red, gray when disabled), state
  badge colored by status, role-aware 'Siguiente paso' hint, tooltips,
  accented captions, list header rows, initial tab by role.
- Self-test: T_Desempate (+10 checks, 97 total).
- Manuals: new screen guide, button names, Example 6 (tie-break), legal
  validation row for the tie-break criterion.

Co-Authored-By: Claude Sonnet 5.5 <noreply@anthropic.com>
Claude-Session: https://claude.ai/code/session_01MYLY6nn23NgZLc9y6Vzcaj
</commit_message>
<xml_diff>
--- a/sic-muni/docs/MANUAL_USUARIO.docx
+++ b/sic-muni/docs/MANUAL_USUARIO.docx
@@ -2444,6 +2444,20 @@
         <w:rPr>
           <w:rFonts w:ascii="Calibri" w:cs="Calibri" w:eastAsia="Calibri" w:hAnsi="Calibri"/>
         </w:rPr>
+        <w:t xml:space="preserve">. Está pensada para que siempre sepa </w:t>
+      </w:r>
+      <w:r>
+        <w:rPr>
+          <w:rFonts w:ascii="Calibri" w:cs="Calibri" w:eastAsia="Calibri" w:hAnsi="Calibri"/>
+          <w:b/>
+          <w:bCs/>
+        </w:rPr>
+        <w:t xml:space="preserve">dónde está y qué sigue</w:t>
+      </w:r>
+      <w:r>
+        <w:rPr>
+          <w:rFonts w:ascii="Calibri" w:cs="Calibri" w:eastAsia="Calibri" w:hAnsi="Calibri"/>
+        </w:rPr>
         <w:t xml:space="preserve">:</w:t>
       </w:r>
     </w:p>
@@ -2460,8 +2474,8 @@
         </w:tblBorders>
       </w:tblPr>
       <w:tblGrid>
-        <w:gridCol w:w="1667"/>
-        <w:gridCol w:w="7693"/>
+        <w:gridCol w:w="3120"/>
+        <w:gridCol w:w="6240"/>
       </w:tblGrid>
       <w:tr>
         <w:trPr>
@@ -2470,7 +2484,7 @@
         </w:trPr>
         <w:tc>
           <w:tcPr>
-            <w:tcW w:type="dxa" w:w="1667"/>
+            <w:tcW w:type="dxa" w:w="3120"/>
             <w:tcBorders>
               <w:top w:val="single" w:color="BFBFBF" w:sz="4"/>
               <w:left w:val="single" w:color="BFBFBF" w:sz="4"/>
@@ -2504,7 +2518,7 @@
         </w:tc>
         <w:tc>
           <w:tcPr>
-            <w:tcW w:type="dxa" w:w="7693"/>
+            <w:tcW w:type="dxa" w:w="6240"/>
             <w:tcBorders>
               <w:top w:val="single" w:color="BFBFBF" w:sz="4"/>
               <w:left w:val="single" w:color="BFBFBF" w:sz="4"/>
@@ -2543,61 +2557,61 @@
         </w:trPr>
         <w:tc>
           <w:tcPr>
-            <w:tcW w:type="dxa" w:w="1667"/>
-            <w:tcBorders>
-              <w:top w:val="single" w:color="BFBFBF" w:sz="4"/>
-              <w:left w:val="single" w:color="BFBFBF" w:sz="4"/>
-              <w:bottom w:val="single" w:color="BFBFBF" w:sz="4"/>
-              <w:right w:val="single" w:color="BFBFBF" w:sz="4"/>
-            </w:tcBorders>
-            <w:tcMar>
-              <w:top w:type="dxa" w:w="60"/>
-              <w:left w:type="dxa" w:w="100"/>
-              <w:bottom w:type="dxa" w:w="60"/>
-              <w:right w:type="dxa" w:w="100"/>
-            </w:tcMar>
-          </w:tcPr>
-          <w:p>
-            <w:pPr>
-              <w:spacing w:after="0"/>
-            </w:pPr>
-            <w:r>
-              <w:rPr>
-                <w:rFonts w:ascii="Calibri" w:cs="Calibri" w:eastAsia="Calibri" w:hAnsi="Calibri"/>
-                <w:sz w:val="19"/>
-                <w:szCs w:val="19"/>
-              </w:rPr>
-              <w:t xml:space="preserve">Arriba</w:t>
-            </w:r>
-          </w:p>
-        </w:tc>
-        <w:tc>
-          <w:tcPr>
-            <w:tcW w:type="dxa" w:w="7693"/>
-            <w:tcBorders>
-              <w:top w:val="single" w:color="BFBFBF" w:sz="4"/>
-              <w:left w:val="single" w:color="BFBFBF" w:sz="4"/>
-              <w:bottom w:val="single" w:color="BFBFBF" w:sz="4"/>
-              <w:right w:val="single" w:color="BFBFBF" w:sz="4"/>
-            </w:tcBorders>
-            <w:tcMar>
-              <w:top w:type="dxa" w:w="60"/>
-              <w:left w:type="dxa" w:w="100"/>
-              <w:bottom w:type="dxa" w:w="60"/>
-              <w:right w:type="dxa" w:w="100"/>
-            </w:tcMar>
-          </w:tcPr>
-          <w:p>
-            <w:pPr>
-              <w:spacing w:after="0"/>
-            </w:pPr>
-            <w:r>
-              <w:rPr>
-                <w:rFonts w:ascii="Calibri" w:cs="Calibri" w:eastAsia="Calibri" w:hAnsi="Calibri"/>
-                <w:sz w:val="19"/>
-                <w:szCs w:val="19"/>
-              </w:rPr>
-              <w:t xml:space="preserve">Su nombre, rol y DA; botón </w:t>
+            <w:tcW w:type="dxa" w:w="3120"/>
+            <w:tcBorders>
+              <w:top w:val="single" w:color="BFBFBF" w:sz="4"/>
+              <w:left w:val="single" w:color="BFBFBF" w:sz="4"/>
+              <w:bottom w:val="single" w:color="BFBFBF" w:sz="4"/>
+              <w:right w:val="single" w:color="BFBFBF" w:sz="4"/>
+            </w:tcBorders>
+            <w:tcMar>
+              <w:top w:type="dxa" w:w="60"/>
+              <w:left w:type="dxa" w:w="100"/>
+              <w:bottom w:type="dxa" w:w="60"/>
+              <w:right w:type="dxa" w:w="100"/>
+            </w:tcMar>
+          </w:tcPr>
+          <w:p>
+            <w:pPr>
+              <w:spacing w:after="0"/>
+            </w:pPr>
+            <w:r>
+              <w:rPr>
+                <w:rFonts w:ascii="Calibri" w:cs="Calibri" w:eastAsia="Calibri" w:hAnsi="Calibri"/>
+                <w:sz w:val="19"/>
+                <w:szCs w:val="19"/>
+              </w:rPr>
+              <w:t xml:space="preserve">Barra azul superior</w:t>
+            </w:r>
+          </w:p>
+        </w:tc>
+        <w:tc>
+          <w:tcPr>
+            <w:tcW w:type="dxa" w:w="6240"/>
+            <w:tcBorders>
+              <w:top w:val="single" w:color="BFBFBF" w:sz="4"/>
+              <w:left w:val="single" w:color="BFBFBF" w:sz="4"/>
+              <w:bottom w:val="single" w:color="BFBFBF" w:sz="4"/>
+              <w:right w:val="single" w:color="BFBFBF" w:sz="4"/>
+            </w:tcBorders>
+            <w:tcMar>
+              <w:top w:type="dxa" w:w="60"/>
+              <w:left w:type="dxa" w:w="100"/>
+              <w:bottom w:type="dxa" w:w="60"/>
+              <w:right w:type="dxa" w:w="100"/>
+            </w:tcMar>
+          </w:tcPr>
+          <w:p>
+            <w:pPr>
+              <w:spacing w:after="0"/>
+            </w:pPr>
+            <w:r>
+              <w:rPr>
+                <w:rFonts w:ascii="Calibri" w:cs="Calibri" w:eastAsia="Calibri" w:hAnsi="Calibri"/>
+                <w:sz w:val="19"/>
+                <w:szCs w:val="19"/>
+              </w:rPr>
+              <w:t xml:space="preserve">Nombre del sistema, su nombre, rol y DA, y el botón rojo </w:t>
             </w:r>
             <w:r>
               <w:rPr>
@@ -2618,62 +2632,24 @@
         </w:trPr>
         <w:tc>
           <w:tcPr>
-            <w:tcW w:type="dxa" w:w="1667"/>
-            <w:tcBorders>
-              <w:top w:val="single" w:color="BFBFBF" w:sz="4"/>
-              <w:left w:val="single" w:color="BFBFBF" w:sz="4"/>
-              <w:bottom w:val="single" w:color="BFBFBF" w:sz="4"/>
-              <w:right w:val="single" w:color="BFBFBF" w:sz="4"/>
-            </w:tcBorders>
-            <w:tcMar>
-              <w:top w:type="dxa" w:w="60"/>
-              <w:left w:type="dxa" w:w="100"/>
-              <w:bottom w:type="dxa" w:w="60"/>
-              <w:right w:type="dxa" w:w="100"/>
-            </w:tcMar>
-          </w:tcPr>
-          <w:p>
-            <w:pPr>
-              <w:spacing w:after="0"/>
-            </w:pPr>
-            <w:r>
-              <w:rPr>
-                <w:rFonts w:ascii="Calibri" w:cs="Calibri" w:eastAsia="Calibri" w:hAnsi="Calibri"/>
-                <w:sz w:val="19"/>
-                <w:szCs w:val="19"/>
-              </w:rPr>
-              <w:t xml:space="preserve">Segunda línea</w:t>
-            </w:r>
-          </w:p>
-        </w:tc>
-        <w:tc>
-          <w:tcPr>
-            <w:tcW w:type="dxa" w:w="7693"/>
-            <w:tcBorders>
-              <w:top w:val="single" w:color="BFBFBF" w:sz="4"/>
-              <w:left w:val="single" w:color="BFBFBF" w:sz="4"/>
-              <w:bottom w:val="single" w:color="BFBFBF" w:sz="4"/>
-              <w:right w:val="single" w:color="BFBFBF" w:sz="4"/>
-            </w:tcBorders>
-            <w:tcMar>
-              <w:top w:type="dxa" w:w="60"/>
-              <w:left w:type="dxa" w:w="100"/>
-              <w:bottom w:type="dxa" w:w="60"/>
-              <w:right w:type="dxa" w:w="100"/>
-            </w:tcMar>
-          </w:tcPr>
-          <w:p>
-            <w:pPr>
-              <w:spacing w:after="0"/>
-            </w:pPr>
-            <w:r>
-              <w:rPr>
-                <w:rFonts w:ascii="Calibri" w:cs="Calibri" w:eastAsia="Calibri" w:hAnsi="Calibri"/>
-                <w:sz w:val="19"/>
-                <w:szCs w:val="19"/>
-              </w:rPr>
-              <w:t xml:space="preserve">Casilla </w:t>
-            </w:r>
+            <w:tcW w:type="dxa" w:w="3120"/>
+            <w:tcBorders>
+              <w:top w:val="single" w:color="BFBFBF" w:sz="4"/>
+              <w:left w:val="single" w:color="BFBFBF" w:sz="4"/>
+              <w:bottom w:val="single" w:color="BFBFBF" w:sz="4"/>
+              <w:right w:val="single" w:color="BFBFBF" w:sz="4"/>
+            </w:tcBorders>
+            <w:tcMar>
+              <w:top w:type="dxa" w:w="60"/>
+              <w:left w:type="dxa" w:w="100"/>
+              <w:bottom w:type="dxa" w:w="60"/>
+              <w:right w:type="dxa" w:w="100"/>
+            </w:tcMar>
+          </w:tcPr>
+          <w:p>
+            <w:pPr>
+              <w:spacing w:after="0"/>
+            </w:pPr>
             <w:r>
               <w:rPr>
                 <w:rFonts w:ascii="Calibri" w:cs="Calibri" w:eastAsia="Calibri" w:hAnsi="Calibri"/>
@@ -2690,7 +2666,7 @@
                 <w:sz w:val="19"/>
                 <w:szCs w:val="19"/>
               </w:rPr>
-              <w:t xml:space="preserve">, botón </w:t>
+              <w:t xml:space="preserve"> y </w:t>
             </w:r>
             <w:r>
               <w:rPr>
@@ -2702,13 +2678,53 @@
               </w:rPr>
               <w:t xml:space="preserve">Cargar</w:t>
             </w:r>
-            <w:r>
-              <w:rPr>
-                <w:rFonts w:ascii="Calibri" w:cs="Calibri" w:eastAsia="Calibri" w:hAnsi="Calibri"/>
-                <w:sz w:val="19"/>
-                <w:szCs w:val="19"/>
-              </w:rPr>
-              <w:t xml:space="preserve"> y, a la derecha, el estado de la solicitud, el monto referencial y la modalidad</w:t>
+          </w:p>
+        </w:tc>
+        <w:tc>
+          <w:tcPr>
+            <w:tcW w:type="dxa" w:w="6240"/>
+            <w:tcBorders>
+              <w:top w:val="single" w:color="BFBFBF" w:sz="4"/>
+              <w:left w:val="single" w:color="BFBFBF" w:sz="4"/>
+              <w:bottom w:val="single" w:color="BFBFBF" w:sz="4"/>
+              <w:right w:val="single" w:color="BFBFBF" w:sz="4"/>
+            </w:tcBorders>
+            <w:tcMar>
+              <w:top w:type="dxa" w:w="60"/>
+              <w:left w:type="dxa" w:w="100"/>
+              <w:bottom w:type="dxa" w:w="60"/>
+              <w:right w:type="dxa" w:w="100"/>
+            </w:tcMar>
+          </w:tcPr>
+          <w:p>
+            <w:pPr>
+              <w:spacing w:after="0"/>
+            </w:pPr>
+            <w:r>
+              <w:rPr>
+                <w:rFonts w:ascii="Calibri" w:cs="Calibri" w:eastAsia="Calibri" w:hAnsi="Calibri"/>
+                <w:sz w:val="19"/>
+                <w:szCs w:val="19"/>
+              </w:rPr>
+              <w:t xml:space="preserve">Escriba el número de una solicitud y pulse </w:t>
+            </w:r>
+            <w:r>
+              <w:rPr>
+                <w:rFonts w:ascii="Calibri" w:cs="Calibri" w:eastAsia="Calibri" w:hAnsi="Calibri"/>
+                <w:b/>
+                <w:bCs/>
+                <w:sz w:val="19"/>
+                <w:szCs w:val="19"/>
+              </w:rPr>
+              <w:t xml:space="preserve">Cargar</w:t>
+            </w:r>
+            <w:r>
+              <w:rPr>
+                <w:rFonts w:ascii="Calibri" w:cs="Calibri" w:eastAsia="Calibri" w:hAnsi="Calibri"/>
+                <w:sz w:val="19"/>
+                <w:szCs w:val="19"/>
+              </w:rPr>
+              <w:t xml:space="preserve"> para trabajar con ella</w:t>
             </w:r>
           </w:p>
         </w:tc>
@@ -2719,54 +2735,32 @@
         </w:trPr>
         <w:tc>
           <w:tcPr>
-            <w:tcW w:type="dxa" w:w="1667"/>
-            <w:tcBorders>
-              <w:top w:val="single" w:color="BFBFBF" w:sz="4"/>
-              <w:left w:val="single" w:color="BFBFBF" w:sz="4"/>
-              <w:bottom w:val="single" w:color="BFBFBF" w:sz="4"/>
-              <w:right w:val="single" w:color="BFBFBF" w:sz="4"/>
-            </w:tcBorders>
-            <w:tcMar>
-              <w:top w:type="dxa" w:w="60"/>
-              <w:left w:type="dxa" w:w="100"/>
-              <w:bottom w:type="dxa" w:w="60"/>
-              <w:right w:type="dxa" w:w="100"/>
-            </w:tcMar>
-          </w:tcPr>
-          <w:p>
-            <w:pPr>
-              <w:spacing w:after="0"/>
-            </w:pPr>
-            <w:r>
-              <w:rPr>
-                <w:rFonts w:ascii="Calibri" w:cs="Calibri" w:eastAsia="Calibri" w:hAnsi="Calibri"/>
-                <w:sz w:val="19"/>
-                <w:szCs w:val="19"/>
-              </w:rPr>
-              <w:t xml:space="preserve">Pestañas</w:t>
-            </w:r>
-          </w:p>
-        </w:tc>
-        <w:tc>
-          <w:tcPr>
-            <w:tcW w:type="dxa" w:w="7693"/>
-            <w:tcBorders>
-              <w:top w:val="single" w:color="BFBFBF" w:sz="4"/>
-              <w:left w:val="single" w:color="BFBFBF" w:sz="4"/>
-              <w:bottom w:val="single" w:color="BFBFBF" w:sz="4"/>
-              <w:right w:val="single" w:color="BFBFBF" w:sz="4"/>
-            </w:tcBorders>
-            <w:tcMar>
-              <w:top w:type="dxa" w:w="60"/>
-              <w:left w:type="dxa" w:w="100"/>
-              <w:bottom w:type="dxa" w:w="60"/>
-              <w:right w:type="dxa" w:w="100"/>
-            </w:tcMar>
-          </w:tcPr>
-          <w:p>
-            <w:pPr>
-              <w:spacing w:after="0"/>
-            </w:pPr>
+            <w:tcW w:type="dxa" w:w="3120"/>
+            <w:tcBorders>
+              <w:top w:val="single" w:color="BFBFBF" w:sz="4"/>
+              <w:left w:val="single" w:color="BFBFBF" w:sz="4"/>
+              <w:bottom w:val="single" w:color="BFBFBF" w:sz="4"/>
+              <w:right w:val="single" w:color="BFBFBF" w:sz="4"/>
+            </w:tcBorders>
+            <w:tcMar>
+              <w:top w:type="dxa" w:w="60"/>
+              <w:left w:type="dxa" w:w="100"/>
+              <w:bottom w:type="dxa" w:w="60"/>
+              <w:right w:type="dxa" w:w="100"/>
+            </w:tcMar>
+          </w:tcPr>
+          <w:p>
+            <w:pPr>
+              <w:spacing w:after="0"/>
+            </w:pPr>
+            <w:r>
+              <w:rPr>
+                <w:rFonts w:ascii="Calibri" w:cs="Calibri" w:eastAsia="Calibri" w:hAnsi="Calibri"/>
+                <w:sz w:val="19"/>
+                <w:szCs w:val="19"/>
+              </w:rPr>
+              <w:t xml:space="preserve">Franja de </w:t>
+            </w:r>
             <w:r>
               <w:rPr>
                 <w:rFonts w:ascii="Calibri" w:cs="Calibri" w:eastAsia="Calibri" w:hAnsi="Calibri"/>
@@ -2775,7 +2769,45 @@
                 <w:sz w:val="19"/>
                 <w:szCs w:val="19"/>
               </w:rPr>
-              <w:t xml:space="preserve">1 Solicitud · 2 Evaluación CHB · 3 Cotizaciones · 4 Presupuesto / C-31 · 5 Orden / Recepción</w:t>
+              <w:t xml:space="preserve">estado</w:t>
+            </w:r>
+            <w:r>
+              <w:rPr>
+                <w:rFonts w:ascii="Calibri" w:cs="Calibri" w:eastAsia="Calibri" w:hAnsi="Calibri"/>
+                <w:sz w:val="19"/>
+                <w:szCs w:val="19"/>
+              </w:rPr>
+              <w:t xml:space="preserve"> (con color)</w:t>
+            </w:r>
+          </w:p>
+        </w:tc>
+        <w:tc>
+          <w:tcPr>
+            <w:tcW w:type="dxa" w:w="6240"/>
+            <w:tcBorders>
+              <w:top w:val="single" w:color="BFBFBF" w:sz="4"/>
+              <w:left w:val="single" w:color="BFBFBF" w:sz="4"/>
+              <w:bottom w:val="single" w:color="BFBFBF" w:sz="4"/>
+              <w:right w:val="single" w:color="BFBFBF" w:sz="4"/>
+            </w:tcBorders>
+            <w:tcMar>
+              <w:top w:type="dxa" w:w="60"/>
+              <w:left w:type="dxa" w:w="100"/>
+              <w:bottom w:type="dxa" w:w="60"/>
+              <w:right w:type="dxa" w:w="100"/>
+            </w:tcMar>
+          </w:tcPr>
+          <w:p>
+            <w:pPr>
+              <w:spacing w:after="0"/>
+            </w:pPr>
+            <w:r>
+              <w:rPr>
+                <w:rFonts w:ascii="Calibri" w:cs="Calibri" w:eastAsia="Calibri" w:hAnsi="Calibri"/>
+                <w:sz w:val="19"/>
+                <w:szCs w:val="19"/>
+              </w:rPr>
+              <w:t xml:space="preserve">El estado, el monto referencial y la modalidad de la solicitud cargada</w:t>
             </w:r>
           </w:p>
         </w:tc>
@@ -2786,7 +2818,175 @@
         </w:trPr>
         <w:tc>
           <w:tcPr>
-            <w:tcW w:type="dxa" w:w="1667"/>
+            <w:tcW w:type="dxa" w:w="3120"/>
+            <w:tcBorders>
+              <w:top w:val="single" w:color="BFBFBF" w:sz="4"/>
+              <w:left w:val="single" w:color="BFBFBF" w:sz="4"/>
+              <w:bottom w:val="single" w:color="BFBFBF" w:sz="4"/>
+              <w:right w:val="single" w:color="BFBFBF" w:sz="4"/>
+            </w:tcBorders>
+            <w:tcMar>
+              <w:top w:type="dxa" w:w="60"/>
+              <w:left w:type="dxa" w:w="100"/>
+              <w:bottom w:type="dxa" w:w="60"/>
+              <w:right w:type="dxa" w:w="100"/>
+            </w:tcMar>
+          </w:tcPr>
+          <w:p>
+            <w:pPr>
+              <w:spacing w:after="0"/>
+            </w:pPr>
+            <w:r>
+              <w:rPr>
+                <w:rFonts w:ascii="Calibri" w:cs="Calibri" w:eastAsia="Calibri" w:hAnsi="Calibri"/>
+                <w:sz w:val="19"/>
+                <w:szCs w:val="19"/>
+              </w:rPr>
+              <w:t xml:space="preserve">Franja amarilla </w:t>
+            </w:r>
+            <w:r>
+              <w:rPr>
+                <w:rFonts w:ascii="Calibri" w:cs="Calibri" w:eastAsia="Calibri" w:hAnsi="Calibri"/>
+                <w:b/>
+                <w:bCs/>
+                <w:sz w:val="19"/>
+                <w:szCs w:val="19"/>
+              </w:rPr>
+              <w:t xml:space="preserve">Siguiente paso</w:t>
+            </w:r>
+          </w:p>
+        </w:tc>
+        <w:tc>
+          <w:tcPr>
+            <w:tcW w:type="dxa" w:w="6240"/>
+            <w:tcBorders>
+              <w:top w:val="single" w:color="BFBFBF" w:sz="4"/>
+              <w:left w:val="single" w:color="BFBFBF" w:sz="4"/>
+              <w:bottom w:val="single" w:color="BFBFBF" w:sz="4"/>
+              <w:right w:val="single" w:color="BFBFBF" w:sz="4"/>
+            </w:tcBorders>
+            <w:tcMar>
+              <w:top w:type="dxa" w:w="60"/>
+              <w:left w:type="dxa" w:w="100"/>
+              <w:bottom w:type="dxa" w:w="60"/>
+              <w:right w:type="dxa" w:w="100"/>
+            </w:tcMar>
+          </w:tcPr>
+          <w:p>
+            <w:pPr>
+              <w:spacing w:after="0"/>
+            </w:pPr>
+            <w:r>
+              <w:rPr>
+                <w:rFonts w:ascii="Calibri" w:cs="Calibri" w:eastAsia="Calibri" w:hAnsi="Calibri"/>
+                <w:sz w:val="19"/>
+                <w:szCs w:val="19"/>
+              </w:rPr>
+              <w:t xml:space="preserve">Le dice, según el estado y </w:t>
+            </w:r>
+            <w:r>
+              <w:rPr>
+                <w:rFonts w:ascii="Calibri" w:cs="Calibri" w:eastAsia="Calibri" w:hAnsi="Calibri"/>
+                <w:b/>
+                <w:bCs/>
+                <w:sz w:val="19"/>
+                <w:szCs w:val="19"/>
+              </w:rPr>
+              <w:t xml:space="preserve">su rol</w:t>
+            </w:r>
+            <w:r>
+              <w:rPr>
+                <w:rFonts w:ascii="Calibri" w:cs="Calibri" w:eastAsia="Calibri" w:hAnsi="Calibri"/>
+                <w:sz w:val="19"/>
+                <w:szCs w:val="19"/>
+              </w:rPr>
+              <w:t xml:space="preserve">, qué debe hacer ahora</w:t>
+            </w:r>
+          </w:p>
+        </w:tc>
+      </w:tr>
+      <w:tr>
+        <w:trPr>
+          <w:cantSplit/>
+        </w:trPr>
+        <w:tc>
+          <w:tcPr>
+            <w:tcW w:type="dxa" w:w="3120"/>
+            <w:tcBorders>
+              <w:top w:val="single" w:color="BFBFBF" w:sz="4"/>
+              <w:left w:val="single" w:color="BFBFBF" w:sz="4"/>
+              <w:bottom w:val="single" w:color="BFBFBF" w:sz="4"/>
+              <w:right w:val="single" w:color="BFBFBF" w:sz="4"/>
+            </w:tcBorders>
+            <w:tcMar>
+              <w:top w:type="dxa" w:w="60"/>
+              <w:left w:type="dxa" w:w="100"/>
+              <w:bottom w:type="dxa" w:w="60"/>
+              <w:right w:type="dxa" w:w="100"/>
+            </w:tcMar>
+          </w:tcPr>
+          <w:p>
+            <w:pPr>
+              <w:spacing w:after="0"/>
+            </w:pPr>
+            <w:r>
+              <w:rPr>
+                <w:rFonts w:ascii="Calibri" w:cs="Calibri" w:eastAsia="Calibri" w:hAnsi="Calibri"/>
+                <w:sz w:val="19"/>
+                <w:szCs w:val="19"/>
+              </w:rPr>
+              <w:t xml:space="preserve">Pestañas de colores</w:t>
+            </w:r>
+          </w:p>
+        </w:tc>
+        <w:tc>
+          <w:tcPr>
+            <w:tcW w:type="dxa" w:w="6240"/>
+            <w:tcBorders>
+              <w:top w:val="single" w:color="BFBFBF" w:sz="4"/>
+              <w:left w:val="single" w:color="BFBFBF" w:sz="4"/>
+              <w:bottom w:val="single" w:color="BFBFBF" w:sz="4"/>
+              <w:right w:val="single" w:color="BFBFBF" w:sz="4"/>
+            </w:tcBorders>
+            <w:tcMar>
+              <w:top w:type="dxa" w:w="60"/>
+              <w:left w:type="dxa" w:w="100"/>
+              <w:bottom w:type="dxa" w:w="60"/>
+              <w:right w:type="dxa" w:w="100"/>
+            </w:tcMar>
+          </w:tcPr>
+          <w:p>
+            <w:pPr>
+              <w:spacing w:after="0"/>
+            </w:pPr>
+            <w:r>
+              <w:rPr>
+                <w:rFonts w:ascii="Calibri" w:cs="Calibri" w:eastAsia="Calibri" w:hAnsi="Calibri"/>
+                <w:b/>
+                <w:bCs/>
+                <w:sz w:val="19"/>
+                <w:szCs w:val="19"/>
+              </w:rPr>
+              <w:t xml:space="preserve">1 Solicitud · 2 Evaluación CHB · 3 Cotizaciones · 4 Presupuesto / C-31 · 5 Orden / Recepción</w:t>
+            </w:r>
+            <w:r>
+              <w:rPr>
+                <w:rFonts w:ascii="Calibri" w:cs="Calibri" w:eastAsia="Calibri" w:hAnsi="Calibri"/>
+                <w:sz w:val="19"/>
+                <w:szCs w:val="19"/>
+              </w:rPr>
+              <w:t xml:space="preserve">. La pestaña activa se resalta con su color; cada pantalla tiene su banner del mismo color</w:t>
+            </w:r>
+          </w:p>
+        </w:tc>
+      </w:tr>
+      <w:tr>
+        <w:trPr>
+          <w:cantSplit/>
+        </w:trPr>
+        <w:tc>
+          <w:tcPr>
+            <w:tcW w:type="dxa" w:w="3120"/>
             <w:tcBorders>
               <w:top w:val="single" w:color="BFBFBF" w:sz="4"/>
               <w:left w:val="single" w:color="BFBFBF" w:sz="4"/>
@@ -2816,31 +3016,41 @@
         </w:tc>
         <w:tc>
           <w:tcPr>
-            <w:tcW w:type="dxa" w:w="7693"/>
-            <w:tcBorders>
-              <w:top w:val="single" w:color="BFBFBF" w:sz="4"/>
-              <w:left w:val="single" w:color="BFBFBF" w:sz="4"/>
-              <w:bottom w:val="single" w:color="BFBFBF" w:sz="4"/>
-              <w:right w:val="single" w:color="BFBFBF" w:sz="4"/>
-            </w:tcBorders>
-            <w:tcMar>
-              <w:top w:type="dxa" w:w="60"/>
-              <w:left w:type="dxa" w:w="100"/>
-              <w:bottom w:type="dxa" w:w="60"/>
-              <w:right w:type="dxa" w:w="100"/>
-            </w:tcMar>
-          </w:tcPr>
-          <w:p>
-            <w:pPr>
-              <w:spacing w:after="0"/>
-            </w:pPr>
-            <w:r>
-              <w:rPr>
-                <w:rFonts w:ascii="Calibri" w:cs="Calibri" w:eastAsia="Calibri" w:hAnsi="Calibri"/>
-                <w:sz w:val="19"/>
-                <w:szCs w:val="19"/>
-              </w:rPr>
-              <w:t xml:space="preserve">Los campos y botones de la pestaña elegida</w:t>
+            <w:tcW w:type="dxa" w:w="6240"/>
+            <w:tcBorders>
+              <w:top w:val="single" w:color="BFBFBF" w:sz="4"/>
+              <w:left w:val="single" w:color="BFBFBF" w:sz="4"/>
+              <w:bottom w:val="single" w:color="BFBFBF" w:sz="4"/>
+              <w:right w:val="single" w:color="BFBFBF" w:sz="4"/>
+            </w:tcBorders>
+            <w:tcMar>
+              <w:top w:type="dxa" w:w="60"/>
+              <w:left w:type="dxa" w:w="100"/>
+              <w:bottom w:type="dxa" w:w="60"/>
+              <w:right w:type="dxa" w:w="100"/>
+            </w:tcMar>
+          </w:tcPr>
+          <w:p>
+            <w:pPr>
+              <w:spacing w:after="0"/>
+            </w:pPr>
+            <w:r>
+              <w:rPr>
+                <w:rFonts w:ascii="Calibri" w:cs="Calibri" w:eastAsia="Calibri" w:hAnsi="Calibri"/>
+                <w:sz w:val="19"/>
+                <w:szCs w:val="19"/>
+              </w:rPr>
+              <w:t xml:space="preserve">Barras de sección con los campos y botones. Pase el mouse sobre un campo o botón para ver una </w:t>
+            </w:r>
+            <w:r>
+              <w:rPr>
+                <w:rFonts w:ascii="Calibri" w:cs="Calibri" w:eastAsia="Calibri" w:hAnsi="Calibri"/>
+                <w:b/>
+                <w:bCs/>
+                <w:sz w:val="19"/>
+                <w:szCs w:val="19"/>
+              </w:rPr>
+              <w:t xml:space="preserve">ayuda emergente</w:t>
             </w:r>
           </w:p>
         </w:tc>
@@ -2850,6 +3060,698 @@
       <w:pPr>
         <w:spacing w:after="160"/>
       </w:pPr>
+    </w:p>
+    <w:p>
+      <w:pPr>
+        <w:spacing w:after="140"/>
+      </w:pPr>
+      <w:r>
+        <w:rPr>
+          <w:rFonts w:ascii="Calibri" w:cs="Calibri" w:eastAsia="Calibri" w:hAnsi="Calibri"/>
+          <w:b/>
+          <w:bCs/>
+        </w:rPr>
+        <w:t xml:space="preserve">Código de colores de los botones</w:t>
+      </w:r>
+      <w:r>
+        <w:rPr>
+          <w:rFonts w:ascii="Calibri" w:cs="Calibri" w:eastAsia="Calibri" w:hAnsi="Calibri"/>
+        </w:rPr>
+        <w:t xml:space="preserve"> (igual en todas las pantallas):</w:t>
+      </w:r>
+    </w:p>
+    <w:tbl>
+      <w:tblPr>
+        <w:tblW w:type="dxa" w:w="9360"/>
+        <w:tblBorders>
+          <w:top w:val="single" w:color="auto" w:sz="4"/>
+          <w:left w:val="single" w:color="auto" w:sz="4"/>
+          <w:bottom w:val="single" w:color="auto" w:sz="4"/>
+          <w:right w:val="single" w:color="auto" w:sz="4"/>
+          <w:insideH w:val="single" w:color="auto" w:sz="4"/>
+          <w:insideV w:val="single" w:color="auto" w:sz="4"/>
+        </w:tblBorders>
+      </w:tblPr>
+      <w:tblGrid>
+        <w:gridCol w:w="900"/>
+        <w:gridCol w:w="3825"/>
+        <w:gridCol w:w="4635"/>
+      </w:tblGrid>
+      <w:tr>
+        <w:trPr>
+          <w:cantSplit/>
+          <w:tblHeader/>
+        </w:trPr>
+        <w:tc>
+          <w:tcPr>
+            <w:tcW w:type="dxa" w:w="900"/>
+            <w:tcBorders>
+              <w:top w:val="single" w:color="BFBFBF" w:sz="4"/>
+              <w:left w:val="single" w:color="BFBFBF" w:sz="4"/>
+              <w:bottom w:val="single" w:color="BFBFBF" w:sz="4"/>
+              <w:right w:val="single" w:color="BFBFBF" w:sz="4"/>
+            </w:tcBorders>
+            <w:shd w:fill="1F4E79" w:val="clear"/>
+            <w:tcMar>
+              <w:top w:type="dxa" w:w="60"/>
+              <w:left w:type="dxa" w:w="100"/>
+              <w:bottom w:type="dxa" w:w="60"/>
+              <w:right w:type="dxa" w:w="100"/>
+            </w:tcMar>
+          </w:tcPr>
+          <w:p>
+            <w:pPr>
+              <w:spacing w:after="0"/>
+            </w:pPr>
+            <w:r>
+              <w:rPr>
+                <w:rFonts w:ascii="Calibri" w:cs="Calibri" w:eastAsia="Calibri" w:hAnsi="Calibri"/>
+                <w:b/>
+                <w:bCs/>
+                <w:color w:val="FFFFFF"/>
+                <w:sz w:val="19"/>
+                <w:szCs w:val="19"/>
+              </w:rPr>
+              <w:t xml:space="preserve">Color</w:t>
+            </w:r>
+          </w:p>
+        </w:tc>
+        <w:tc>
+          <w:tcPr>
+            <w:tcW w:type="dxa" w:w="3825"/>
+            <w:tcBorders>
+              <w:top w:val="single" w:color="BFBFBF" w:sz="4"/>
+              <w:left w:val="single" w:color="BFBFBF" w:sz="4"/>
+              <w:bottom w:val="single" w:color="BFBFBF" w:sz="4"/>
+              <w:right w:val="single" w:color="BFBFBF" w:sz="4"/>
+            </w:tcBorders>
+            <w:shd w:fill="1F4E79" w:val="clear"/>
+            <w:tcMar>
+              <w:top w:type="dxa" w:w="60"/>
+              <w:left w:type="dxa" w:w="100"/>
+              <w:bottom w:type="dxa" w:w="60"/>
+              <w:right w:type="dxa" w:w="100"/>
+            </w:tcMar>
+          </w:tcPr>
+          <w:p>
+            <w:pPr>
+              <w:spacing w:after="0"/>
+            </w:pPr>
+            <w:r>
+              <w:rPr>
+                <w:rFonts w:ascii="Calibri" w:cs="Calibri" w:eastAsia="Calibri" w:hAnsi="Calibri"/>
+                <w:b/>
+                <w:bCs/>
+                <w:color w:val="FFFFFF"/>
+                <w:sz w:val="19"/>
+                <w:szCs w:val="19"/>
+              </w:rPr>
+              <w:t xml:space="preserve">Significado</w:t>
+            </w:r>
+          </w:p>
+        </w:tc>
+        <w:tc>
+          <w:tcPr>
+            <w:tcW w:type="dxa" w:w="4635"/>
+            <w:tcBorders>
+              <w:top w:val="single" w:color="BFBFBF" w:sz="4"/>
+              <w:left w:val="single" w:color="BFBFBF" w:sz="4"/>
+              <w:bottom w:val="single" w:color="BFBFBF" w:sz="4"/>
+              <w:right w:val="single" w:color="BFBFBF" w:sz="4"/>
+            </w:tcBorders>
+            <w:shd w:fill="1F4E79" w:val="clear"/>
+            <w:tcMar>
+              <w:top w:type="dxa" w:w="60"/>
+              <w:left w:type="dxa" w:w="100"/>
+              <w:bottom w:type="dxa" w:w="60"/>
+              <w:right w:type="dxa" w:w="100"/>
+            </w:tcMar>
+          </w:tcPr>
+          <w:p>
+            <w:pPr>
+              <w:spacing w:after="0"/>
+            </w:pPr>
+            <w:r>
+              <w:rPr>
+                <w:rFonts w:ascii="Calibri" w:cs="Calibri" w:eastAsia="Calibri" w:hAnsi="Calibri"/>
+                <w:b/>
+                <w:bCs/>
+                <w:color w:val="FFFFFF"/>
+                <w:sz w:val="19"/>
+                <w:szCs w:val="19"/>
+              </w:rPr>
+              <w:t xml:space="preserve">Ejemplos</w:t>
+            </w:r>
+          </w:p>
+        </w:tc>
+      </w:tr>
+      <w:tr>
+        <w:trPr>
+          <w:cantSplit/>
+        </w:trPr>
+        <w:tc>
+          <w:tcPr>
+            <w:tcW w:type="dxa" w:w="900"/>
+            <w:tcBorders>
+              <w:top w:val="single" w:color="BFBFBF" w:sz="4"/>
+              <w:left w:val="single" w:color="BFBFBF" w:sz="4"/>
+              <w:bottom w:val="single" w:color="BFBFBF" w:sz="4"/>
+              <w:right w:val="single" w:color="BFBFBF" w:sz="4"/>
+            </w:tcBorders>
+            <w:tcMar>
+              <w:top w:type="dxa" w:w="60"/>
+              <w:left w:type="dxa" w:w="100"/>
+              <w:bottom w:type="dxa" w:w="60"/>
+              <w:right w:type="dxa" w:w="100"/>
+            </w:tcMar>
+          </w:tcPr>
+          <w:p>
+            <w:pPr>
+              <w:spacing w:after="0"/>
+            </w:pPr>
+            <w:r>
+              <w:rPr>
+                <w:rFonts w:ascii="Calibri" w:cs="Calibri" w:eastAsia="Calibri" w:hAnsi="Calibri"/>
+                <w:sz w:val="19"/>
+                <w:szCs w:val="19"/>
+              </w:rPr>
+              <w:t xml:space="preserve">Azul</w:t>
+            </w:r>
+          </w:p>
+        </w:tc>
+        <w:tc>
+          <w:tcPr>
+            <w:tcW w:type="dxa" w:w="3825"/>
+            <w:tcBorders>
+              <w:top w:val="single" w:color="BFBFBF" w:sz="4"/>
+              <w:left w:val="single" w:color="BFBFBF" w:sz="4"/>
+              <w:bottom w:val="single" w:color="BFBFBF" w:sz="4"/>
+              <w:right w:val="single" w:color="BFBFBF" w:sz="4"/>
+            </w:tcBorders>
+            <w:tcMar>
+              <w:top w:type="dxa" w:w="60"/>
+              <w:left w:type="dxa" w:w="100"/>
+              <w:bottom w:type="dxa" w:w="60"/>
+              <w:right w:type="dxa" w:w="100"/>
+            </w:tcMar>
+          </w:tcPr>
+          <w:p>
+            <w:pPr>
+              <w:spacing w:after="0"/>
+            </w:pPr>
+            <w:r>
+              <w:rPr>
+                <w:rFonts w:ascii="Calibri" w:cs="Calibri" w:eastAsia="Calibri" w:hAnsi="Calibri"/>
+                <w:sz w:val="19"/>
+                <w:szCs w:val="19"/>
+              </w:rPr>
+              <w:t xml:space="preserve">Registrar o consultar datos</w:t>
+            </w:r>
+          </w:p>
+        </w:tc>
+        <w:tc>
+          <w:tcPr>
+            <w:tcW w:type="dxa" w:w="4635"/>
+            <w:tcBorders>
+              <w:top w:val="single" w:color="BFBFBF" w:sz="4"/>
+              <w:left w:val="single" w:color="BFBFBF" w:sz="4"/>
+              <w:bottom w:val="single" w:color="BFBFBF" w:sz="4"/>
+              <w:right w:val="single" w:color="BFBFBF" w:sz="4"/>
+            </w:tcBorders>
+            <w:tcMar>
+              <w:top w:type="dxa" w:w="60"/>
+              <w:left w:type="dxa" w:w="100"/>
+              <w:bottom w:type="dxa" w:w="60"/>
+              <w:right w:type="dxa" w:w="100"/>
+            </w:tcMar>
+          </w:tcPr>
+          <w:p>
+            <w:pPr>
+              <w:spacing w:after="0"/>
+            </w:pPr>
+            <w:r>
+              <w:rPr>
+                <w:rFonts w:ascii="Calibri" w:cs="Calibri" w:eastAsia="Calibri" w:hAnsi="Calibri"/>
+                <w:sz w:val="19"/>
+                <w:szCs w:val="19"/>
+              </w:rPr>
+              <w:t xml:space="preserve">Crear solicitud, Agregar ítem, Registrar oferta, Consultar saldo</w:t>
+            </w:r>
+          </w:p>
+        </w:tc>
+      </w:tr>
+      <w:tr>
+        <w:trPr>
+          <w:cantSplit/>
+        </w:trPr>
+        <w:tc>
+          <w:tcPr>
+            <w:tcW w:type="dxa" w:w="900"/>
+            <w:tcBorders>
+              <w:top w:val="single" w:color="BFBFBF" w:sz="4"/>
+              <w:left w:val="single" w:color="BFBFBF" w:sz="4"/>
+              <w:bottom w:val="single" w:color="BFBFBF" w:sz="4"/>
+              <w:right w:val="single" w:color="BFBFBF" w:sz="4"/>
+            </w:tcBorders>
+            <w:tcMar>
+              <w:top w:type="dxa" w:w="60"/>
+              <w:left w:type="dxa" w:w="100"/>
+              <w:bottom w:type="dxa" w:w="60"/>
+              <w:right w:type="dxa" w:w="100"/>
+            </w:tcMar>
+          </w:tcPr>
+          <w:p>
+            <w:pPr>
+              <w:spacing w:after="0"/>
+            </w:pPr>
+            <w:r>
+              <w:rPr>
+                <w:rFonts w:ascii="Calibri" w:cs="Calibri" w:eastAsia="Calibri" w:hAnsi="Calibri"/>
+                <w:sz w:val="19"/>
+                <w:szCs w:val="19"/>
+              </w:rPr>
+              <w:t xml:space="preserve">Verde</w:t>
+            </w:r>
+          </w:p>
+        </w:tc>
+        <w:tc>
+          <w:tcPr>
+            <w:tcW w:type="dxa" w:w="3825"/>
+            <w:tcBorders>
+              <w:top w:val="single" w:color="BFBFBF" w:sz="4"/>
+              <w:left w:val="single" w:color="BFBFBF" w:sz="4"/>
+              <w:bottom w:val="single" w:color="BFBFBF" w:sz="4"/>
+              <w:right w:val="single" w:color="BFBFBF" w:sz="4"/>
+            </w:tcBorders>
+            <w:tcMar>
+              <w:top w:type="dxa" w:w="60"/>
+              <w:left w:type="dxa" w:w="100"/>
+              <w:bottom w:type="dxa" w:w="60"/>
+              <w:right w:type="dxa" w:w="100"/>
+            </w:tcMar>
+          </w:tcPr>
+          <w:p>
+            <w:pPr>
+              <w:spacing w:after="0"/>
+            </w:pPr>
+            <w:r>
+              <w:rPr>
+                <w:rFonts w:ascii="Calibri" w:cs="Calibri" w:eastAsia="Calibri" w:hAnsi="Calibri"/>
+                <w:sz w:val="19"/>
+                <w:szCs w:val="19"/>
+              </w:rPr>
+              <w:t xml:space="preserve">Avanza el trámite al siguiente estado</w:t>
+            </w:r>
+          </w:p>
+        </w:tc>
+        <w:tc>
+          <w:tcPr>
+            <w:tcW w:type="dxa" w:w="4635"/>
+            <w:tcBorders>
+              <w:top w:val="single" w:color="BFBFBF" w:sz="4"/>
+              <w:left w:val="single" w:color="BFBFBF" w:sz="4"/>
+              <w:bottom w:val="single" w:color="BFBFBF" w:sz="4"/>
+              <w:right w:val="single" w:color="BFBFBF" w:sz="4"/>
+            </w:tcBorders>
+            <w:tcMar>
+              <w:top w:type="dxa" w:w="60"/>
+              <w:left w:type="dxa" w:w="100"/>
+              <w:bottom w:type="dxa" w:w="60"/>
+              <w:right w:type="dxa" w:w="100"/>
+            </w:tcMar>
+          </w:tcPr>
+          <w:p>
+            <w:pPr>
+              <w:spacing w:after="0"/>
+            </w:pPr>
+            <w:r>
+              <w:rPr>
+                <w:rFonts w:ascii="Calibri" w:cs="Calibri" w:eastAsia="Calibri" w:hAnsi="Calibri"/>
+                <w:sz w:val="19"/>
+                <w:szCs w:val="19"/>
+              </w:rPr>
+              <w:t xml:space="preserve">Enviar a cotización, Evaluar cuadro, Adjudicar, Emitir C-31, Generar Orden, Registrar recepción</w:t>
+            </w:r>
+          </w:p>
+        </w:tc>
+      </w:tr>
+      <w:tr>
+        <w:trPr>
+          <w:cantSplit/>
+        </w:trPr>
+        <w:tc>
+          <w:tcPr>
+            <w:tcW w:type="dxa" w:w="900"/>
+            <w:tcBorders>
+              <w:top w:val="single" w:color="BFBFBF" w:sz="4"/>
+              <w:left w:val="single" w:color="BFBFBF" w:sz="4"/>
+              <w:bottom w:val="single" w:color="BFBFBF" w:sz="4"/>
+              <w:right w:val="single" w:color="BFBFBF" w:sz="4"/>
+            </w:tcBorders>
+            <w:tcMar>
+              <w:top w:type="dxa" w:w="60"/>
+              <w:left w:type="dxa" w:w="100"/>
+              <w:bottom w:type="dxa" w:w="60"/>
+              <w:right w:type="dxa" w:w="100"/>
+            </w:tcMar>
+          </w:tcPr>
+          <w:p>
+            <w:pPr>
+              <w:spacing w:after="0"/>
+            </w:pPr>
+            <w:r>
+              <w:rPr>
+                <w:rFonts w:ascii="Calibri" w:cs="Calibri" w:eastAsia="Calibri" w:hAnsi="Calibri"/>
+                <w:sz w:val="19"/>
+                <w:szCs w:val="19"/>
+              </w:rPr>
+              <w:t xml:space="preserve">Violeta</w:t>
+            </w:r>
+          </w:p>
+        </w:tc>
+        <w:tc>
+          <w:tcPr>
+            <w:tcW w:type="dxa" w:w="3825"/>
+            <w:tcBorders>
+              <w:top w:val="single" w:color="BFBFBF" w:sz="4"/>
+              <w:left w:val="single" w:color="BFBFBF" w:sz="4"/>
+              <w:bottom w:val="single" w:color="BFBFBF" w:sz="4"/>
+              <w:right w:val="single" w:color="BFBFBF" w:sz="4"/>
+            </w:tcBorders>
+            <w:tcMar>
+              <w:top w:type="dxa" w:w="60"/>
+              <w:left w:type="dxa" w:w="100"/>
+              <w:bottom w:type="dxa" w:w="60"/>
+              <w:right w:type="dxa" w:w="100"/>
+            </w:tcMar>
+          </w:tcPr>
+          <w:p>
+            <w:pPr>
+              <w:spacing w:after="0"/>
+            </w:pPr>
+            <w:r>
+              <w:rPr>
+                <w:rFonts w:ascii="Calibri" w:cs="Calibri" w:eastAsia="Calibri" w:hAnsi="Calibri"/>
+                <w:sz w:val="19"/>
+                <w:szCs w:val="19"/>
+              </w:rPr>
+              <w:t xml:space="preserve">Genera un documento PDF</w:t>
+            </w:r>
+          </w:p>
+        </w:tc>
+        <w:tc>
+          <w:tcPr>
+            <w:tcW w:type="dxa" w:w="4635"/>
+            <w:tcBorders>
+              <w:top w:val="single" w:color="BFBFBF" w:sz="4"/>
+              <w:left w:val="single" w:color="BFBFBF" w:sz="4"/>
+              <w:bottom w:val="single" w:color="BFBFBF" w:sz="4"/>
+              <w:right w:val="single" w:color="BFBFBF" w:sz="4"/>
+            </w:tcBorders>
+            <w:tcMar>
+              <w:top w:type="dxa" w:w="60"/>
+              <w:left w:type="dxa" w:w="100"/>
+              <w:bottom w:type="dxa" w:w="60"/>
+              <w:right w:type="dxa" w:w="100"/>
+            </w:tcMar>
+          </w:tcPr>
+          <w:p>
+            <w:pPr>
+              <w:spacing w:after="0"/>
+            </w:pPr>
+            <w:r>
+              <w:rPr>
+                <w:rFonts w:ascii="Calibri" w:cs="Calibri" w:eastAsia="Calibri" w:hAnsi="Calibri"/>
+                <w:sz w:val="19"/>
+                <w:szCs w:val="19"/>
+              </w:rPr>
+              <w:t xml:space="preserve">Imprimir C-1, Imprimir Orden, Imprimir acta</w:t>
+            </w:r>
+          </w:p>
+        </w:tc>
+      </w:tr>
+      <w:tr>
+        <w:trPr>
+          <w:cantSplit/>
+        </w:trPr>
+        <w:tc>
+          <w:tcPr>
+            <w:tcW w:type="dxa" w:w="900"/>
+            <w:tcBorders>
+              <w:top w:val="single" w:color="BFBFBF" w:sz="4"/>
+              <w:left w:val="single" w:color="BFBFBF" w:sz="4"/>
+              <w:bottom w:val="single" w:color="BFBFBF" w:sz="4"/>
+              <w:right w:val="single" w:color="BFBFBF" w:sz="4"/>
+            </w:tcBorders>
+            <w:tcMar>
+              <w:top w:type="dxa" w:w="60"/>
+              <w:left w:type="dxa" w:w="100"/>
+              <w:bottom w:type="dxa" w:w="60"/>
+              <w:right w:type="dxa" w:w="100"/>
+            </w:tcMar>
+          </w:tcPr>
+          <w:p>
+            <w:pPr>
+              <w:spacing w:after="0"/>
+            </w:pPr>
+            <w:r>
+              <w:rPr>
+                <w:rFonts w:ascii="Calibri" w:cs="Calibri" w:eastAsia="Calibri" w:hAnsi="Calibri"/>
+                <w:sz w:val="19"/>
+                <w:szCs w:val="19"/>
+              </w:rPr>
+              <w:t xml:space="preserve">Rojo</w:t>
+            </w:r>
+          </w:p>
+        </w:tc>
+        <w:tc>
+          <w:tcPr>
+            <w:tcW w:type="dxa" w:w="3825"/>
+            <w:tcBorders>
+              <w:top w:val="single" w:color="BFBFBF" w:sz="4"/>
+              <w:left w:val="single" w:color="BFBFBF" w:sz="4"/>
+              <w:bottom w:val="single" w:color="BFBFBF" w:sz="4"/>
+              <w:right w:val="single" w:color="BFBFBF" w:sz="4"/>
+            </w:tcBorders>
+            <w:tcMar>
+              <w:top w:type="dxa" w:w="60"/>
+              <w:left w:type="dxa" w:w="100"/>
+              <w:bottom w:type="dxa" w:w="60"/>
+              <w:right w:type="dxa" w:w="100"/>
+            </w:tcMar>
+          </w:tcPr>
+          <w:p>
+            <w:pPr>
+              <w:spacing w:after="0"/>
+            </w:pPr>
+            <w:r>
+              <w:rPr>
+                <w:rFonts w:ascii="Calibri" w:cs="Calibri" w:eastAsia="Calibri" w:hAnsi="Calibri"/>
+                <w:sz w:val="19"/>
+                <w:szCs w:val="19"/>
+              </w:rPr>
+              <w:t xml:space="preserve">Acción que anula o revierte (pide motivo)</w:t>
+            </w:r>
+          </w:p>
+        </w:tc>
+        <w:tc>
+          <w:tcPr>
+            <w:tcW w:type="dxa" w:w="4635"/>
+            <w:tcBorders>
+              <w:top w:val="single" w:color="BFBFBF" w:sz="4"/>
+              <w:left w:val="single" w:color="BFBFBF" w:sz="4"/>
+              <w:bottom w:val="single" w:color="BFBFBF" w:sz="4"/>
+              <w:right w:val="single" w:color="BFBFBF" w:sz="4"/>
+            </w:tcBorders>
+            <w:tcMar>
+              <w:top w:type="dxa" w:w="60"/>
+              <w:left w:type="dxa" w:w="100"/>
+              <w:bottom w:type="dxa" w:w="60"/>
+              <w:right w:type="dxa" w:w="100"/>
+            </w:tcMar>
+          </w:tcPr>
+          <w:p>
+            <w:pPr>
+              <w:spacing w:after="0"/>
+            </w:pPr>
+            <w:r>
+              <w:rPr>
+                <w:rFonts w:ascii="Calibri" w:cs="Calibri" w:eastAsia="Calibri" w:hAnsi="Calibri"/>
+                <w:sz w:val="19"/>
+                <w:szCs w:val="19"/>
+              </w:rPr>
+              <w:t xml:space="preserve">Reversión parcial, Reversión total, Anular Orden, Anular solicitud</w:t>
+            </w:r>
+          </w:p>
+        </w:tc>
+      </w:tr>
+      <w:tr>
+        <w:trPr>
+          <w:cantSplit/>
+        </w:trPr>
+        <w:tc>
+          <w:tcPr>
+            <w:tcW w:type="dxa" w:w="900"/>
+            <w:tcBorders>
+              <w:top w:val="single" w:color="BFBFBF" w:sz="4"/>
+              <w:left w:val="single" w:color="BFBFBF" w:sz="4"/>
+              <w:bottom w:val="single" w:color="BFBFBF" w:sz="4"/>
+              <w:right w:val="single" w:color="BFBFBF" w:sz="4"/>
+            </w:tcBorders>
+            <w:tcMar>
+              <w:top w:type="dxa" w:w="60"/>
+              <w:left w:type="dxa" w:w="100"/>
+              <w:bottom w:type="dxa" w:w="60"/>
+              <w:right w:type="dxa" w:w="100"/>
+            </w:tcMar>
+          </w:tcPr>
+          <w:p>
+            <w:pPr>
+              <w:spacing w:after="0"/>
+            </w:pPr>
+            <w:r>
+              <w:rPr>
+                <w:rFonts w:ascii="Calibri" w:cs="Calibri" w:eastAsia="Calibri" w:hAnsi="Calibri"/>
+                <w:sz w:val="19"/>
+                <w:szCs w:val="19"/>
+              </w:rPr>
+              <w:t xml:space="preserve">Gris</w:t>
+            </w:r>
+          </w:p>
+        </w:tc>
+        <w:tc>
+          <w:tcPr>
+            <w:tcW w:type="dxa" w:w="3825"/>
+            <w:tcBorders>
+              <w:top w:val="single" w:color="BFBFBF" w:sz="4"/>
+              <w:left w:val="single" w:color="BFBFBF" w:sz="4"/>
+              <w:bottom w:val="single" w:color="BFBFBF" w:sz="4"/>
+              <w:right w:val="single" w:color="BFBFBF" w:sz="4"/>
+            </w:tcBorders>
+            <w:tcMar>
+              <w:top w:type="dxa" w:w="60"/>
+              <w:left w:type="dxa" w:w="100"/>
+              <w:bottom w:type="dxa" w:w="60"/>
+              <w:right w:type="dxa" w:w="100"/>
+            </w:tcMar>
+          </w:tcPr>
+          <w:p>
+            <w:pPr>
+              <w:spacing w:after="0"/>
+            </w:pPr>
+            <w:r>
+              <w:rPr>
+                <w:rFonts w:ascii="Calibri" w:cs="Calibri" w:eastAsia="Calibri" w:hAnsi="Calibri"/>
+                <w:b/>
+                <w:bCs/>
+                <w:sz w:val="19"/>
+                <w:szCs w:val="19"/>
+              </w:rPr>
+              <w:t xml:space="preserve">Botón no disponible para su rol</w:t>
+            </w:r>
+            <w:r>
+              <w:rPr>
+                <w:rFonts w:ascii="Calibri" w:cs="Calibri" w:eastAsia="Calibri" w:hAnsi="Calibri"/>
+                <w:sz w:val="19"/>
+                <w:szCs w:val="19"/>
+              </w:rPr>
+              <w:t xml:space="preserve"> (deshabilitado)</w:t>
+            </w:r>
+          </w:p>
+        </w:tc>
+        <w:tc>
+          <w:tcPr>
+            <w:tcW w:type="dxa" w:w="4635"/>
+            <w:tcBorders>
+              <w:top w:val="single" w:color="BFBFBF" w:sz="4"/>
+              <w:left w:val="single" w:color="BFBFBF" w:sz="4"/>
+              <w:bottom w:val="single" w:color="BFBFBF" w:sz="4"/>
+              <w:right w:val="single" w:color="BFBFBF" w:sz="4"/>
+            </w:tcBorders>
+            <w:tcMar>
+              <w:top w:type="dxa" w:w="60"/>
+              <w:left w:type="dxa" w:w="100"/>
+              <w:bottom w:type="dxa" w:w="60"/>
+              <w:right w:type="dxa" w:w="100"/>
+            </w:tcMar>
+          </w:tcPr>
+          <w:p>
+            <w:pPr>
+              <w:spacing w:after="0"/>
+            </w:pPr>
+            <w:r>
+              <w:rPr>
+                <w:rFonts w:ascii="Calibri" w:cs="Calibri" w:eastAsia="Calibri" w:hAnsi="Calibri"/>
+                <w:sz w:val="19"/>
+                <w:szCs w:val="19"/>
+              </w:rPr>
+              <w:t xml:space="preserve">—</w:t>
+            </w:r>
+          </w:p>
+        </w:tc>
+      </w:tr>
+    </w:tbl>
+    <w:p>
+      <w:pPr>
+        <w:spacing w:after="160"/>
+      </w:pPr>
+    </w:p>
+    <w:p>
+      <w:pPr>
+        <w:spacing w:after="140"/>
+      </w:pPr>
+      <w:r>
+        <w:rPr>
+          <w:rFonts w:ascii="Calibri" w:cs="Calibri" w:eastAsia="Calibri" w:hAnsi="Calibri"/>
+          <w:b/>
+          <w:bCs/>
+        </w:rPr>
+        <w:t xml:space="preserve">Color del estado:</w:t>
+      </w:r>
+      <w:r>
+        <w:rPr>
+          <w:rFonts w:ascii="Calibri" w:cs="Calibri" w:eastAsia="Calibri" w:hAnsi="Calibri"/>
+        </w:rPr>
+        <w:t xml:space="preserve"> gris = BORRADOR · azul = EN_COTIZACION · verde azulado = EVALUADA · ámbar = PRESUPUESTADA · violeta = ADJUDICADA · verde = ORDEN_EMITIDA · rojo = ANULADA.</w:t>
+      </w:r>
+    </w:p>
+    <w:p>
+      <w:pPr>
+        <w:spacing w:after="140"/>
+      </w:pPr>
+      <w:r>
+        <w:rPr>
+          <w:rFonts w:ascii="Calibri" w:cs="Calibri" w:eastAsia="Calibri" w:hAnsi="Calibri"/>
+          <w:b/>
+          <w:bCs/>
+        </w:rPr>
+        <w:t xml:space="preserve">Pestaña inicial:</w:t>
+      </w:r>
+      <w:r>
+        <w:rPr>
+          <w:rFonts w:ascii="Calibri" w:cs="Calibri" w:eastAsia="Calibri" w:hAnsi="Calibri"/>
+        </w:rPr>
+        <w:t xml:space="preserve"> el sistema abre en la que más usa su rol (US → 1, RC → 2, PF → 4).</w:t>
+      </w:r>
+    </w:p>
+    <w:p>
+      <w:pPr>
+        <w:spacing w:after="140"/>
+      </w:pPr>
+      <w:r>
+        <w:rPr>
+          <w:rFonts w:ascii="Calibri" w:cs="Calibri" w:eastAsia="Calibri" w:hAnsi="Calibri"/>
+          <w:b/>
+          <w:bCs/>
+        </w:rPr>
+        <w:t xml:space="preserve">Listas:</w:t>
+      </w:r>
+      <w:r>
+        <w:rPr>
+          <w:rFonts w:ascii="Calibri" w:cs="Calibri" w:eastAsia="Calibri" w:hAnsi="Calibri"/>
+        </w:rPr>
+        <w:t xml:space="preserve"> la primera fila de cada lista son los títulos de las columnas; las demás son los datos. Al adjudicar seleccione una fila de datos, no la de títulos.</w:t>
+      </w:r>
     </w:p>
     <w:p>
       <w:pPr>
@@ -2902,32 +3804,7 @@
         <w:rPr>
           <w:rFonts w:ascii="Calibri" w:cs="Calibri" w:eastAsia="Calibri" w:hAnsi="Calibri"/>
         </w:rPr>
-        <w:t xml:space="preserve">. Se actualizan el estado, la lista de ítems y la lista de cotizaciones.</w:t>
-      </w:r>
-    </w:p>
-    <w:p>
-      <w:pPr>
-        <w:spacing w:after="140"/>
-      </w:pPr>
-      <w:r>
-        <w:rPr>
-          <w:rFonts w:ascii="Calibri" w:cs="Calibri" w:eastAsia="Calibri" w:hAnsi="Calibri"/>
-        </w:rPr>
-        <w:t xml:space="preserve">Los botones que su rol no puede usar aparecen </w:t>
-      </w:r>
-      <w:r>
-        <w:rPr>
-          <w:rFonts w:ascii="Calibri" w:cs="Calibri" w:eastAsia="Calibri" w:hAnsi="Calibri"/>
-          <w:b/>
-          <w:bCs/>
-        </w:rPr>
-        <w:t xml:space="preserve">deshabilitados</w:t>
-      </w:r>
-      <w:r>
-        <w:rPr>
-          <w:rFonts w:ascii="Calibri" w:cs="Calibri" w:eastAsia="Calibri" w:hAnsi="Calibri"/>
-        </w:rPr>
-        <w:t xml:space="preserve"> (en gris).</w:t>
+        <w:t xml:space="preserve">. Se actualizan el estado, la sugerencia, la lista de ítems y la de cotizaciones.</w:t>
       </w:r>
     </w:p>
     <w:p>
@@ -3310,7 +4187,7 @@
           <w:b/>
           <w:bCs/>
         </w:rPr>
-        <w:t xml:space="preserve">Agregar item</w:t>
+        <w:t xml:space="preserve">Agregar ítem</w:t>
       </w:r>
       <w:r>
         <w:rPr>
@@ -3769,7 +4646,7 @@
           <w:b/>
           <w:bCs/>
         </w:rPr>
-        <w:t xml:space="preserve">Generar C-1 (PDF)</w:t>
+        <w:t xml:space="preserve">Imprimir C-1 (PDF)</w:t>
       </w:r>
       <w:r>
         <w:rPr>
@@ -4263,7 +5140,7 @@
           <w:b/>
           <w:bCs/>
         </w:rPr>
-        <w:t xml:space="preserve">Justificación de excepción (PDF)</w:t>
+        <w:t xml:space="preserve">Imprimir justificación de excepción (PDF)</w:t>
       </w:r>
       <w:r>
         <w:rPr>
@@ -4957,15 +5834,44 @@
         <w:rPr>
           <w:rFonts w:ascii="Calibri" w:cs="Calibri" w:eastAsia="Calibri" w:hAnsi="Calibri"/>
         </w:rPr>
-        <w:t xml:space="preserve"> si corresponde. Pulse </w:t>
-      </w:r>
-      <w:r>
-        <w:rPr>
-          <w:rFonts w:ascii="Calibri" w:cs="Calibri" w:eastAsia="Calibri" w:hAnsi="Calibri"/>
-          <w:b/>
-          <w:bCs/>
-        </w:rPr>
-        <w:t xml:space="preserve">Registrar</w:t>
+        <w:t xml:space="preserve"> si corresponde. En </w:t>
+      </w:r>
+      <w:r>
+        <w:rPr>
+          <w:rFonts w:ascii="Calibri" w:cs="Calibri" w:eastAsia="Calibri" w:hAnsi="Calibri"/>
+          <w:b/>
+          <w:bCs/>
+        </w:rPr>
+        <w:t xml:space="preserve">Recibida el</w:t>
+      </w:r>
+      <w:r>
+        <w:rPr>
+          <w:rFonts w:ascii="Calibri" w:cs="Calibri" w:eastAsia="Calibri" w:hAnsi="Calibri"/>
+        </w:rPr>
+        <w:t xml:space="preserve"> escriba, si lo sabe, la fecha y hora en que el proveedor entregó o envió su oferta (</w:t>
+      </w:r>
+      <w:r>
+        <w:rPr>
+          <w:rFonts w:ascii="Consolas" w:cs="Consolas" w:eastAsia="Consolas" w:hAnsi="Consolas"/>
+          <w:sz w:val="20"/>
+          <w:szCs w:val="20"/>
+          <w:shd w:fill="EDEDED" w:val="clear"/>
+        </w:rPr>
+        <w:t xml:space="preserve">dd/mm/aaaa hh:mm</w:t>
+      </w:r>
+      <w:r>
+        <w:rPr>
+          <w:rFonts w:ascii="Calibri" w:cs="Calibri" w:eastAsia="Calibri" w:hAnsi="Calibri"/>
+        </w:rPr>
+        <w:t xml:space="preserve">, no puede ser futura); si lo deja vacío se usa el momento en que usted la registra. Pulse </w:t>
+      </w:r>
+      <w:r>
+        <w:rPr>
+          <w:rFonts w:ascii="Calibri" w:cs="Calibri" w:eastAsia="Calibri" w:hAnsi="Calibri"/>
+          <w:b/>
+          <w:bCs/>
+        </w:rPr>
+        <w:t xml:space="preserve">Registrar oferta</w:t>
       </w:r>
       <w:r>
         <w:rPr>
@@ -5088,36 +5994,58 @@
       <w:r>
         <w:rPr>
           <w:rFonts w:ascii="Calibri" w:cs="Calibri" w:eastAsia="Calibri" w:hAnsi="Calibri"/>
-        </w:rPr>
-        <w:t xml:space="preserve">Si hay </w:t>
-      </w:r>
-      <w:r>
-        <w:rPr>
-          <w:rFonts w:ascii="Calibri" w:cs="Calibri" w:eastAsia="Calibri" w:hAnsi="Calibri"/>
-          <w:b/>
-          <w:bCs/>
-        </w:rPr>
-        <w:t xml:space="preserve">empate</w:t>
-      </w:r>
-      <w:r>
-        <w:rPr>
-          <w:rFonts w:ascii="Calibri" w:cs="Calibri" w:eastAsia="Calibri" w:hAnsi="Calibri"/>
-        </w:rPr>
-        <w:t xml:space="preserve"> en el precio más bajo, el sistema avisa y </w:t>
-      </w:r>
-      <w:r>
-        <w:rPr>
-          <w:rFonts w:ascii="Calibri" w:cs="Calibri" w:eastAsia="Calibri" w:hAnsi="Calibri"/>
-          <w:b/>
-          <w:bCs/>
-        </w:rPr>
-        <w:t xml:space="preserve">no</w:t>
-      </w:r>
-      <w:r>
-        <w:rPr>
-          <w:rFonts w:ascii="Calibri" w:cs="Calibri" w:eastAsia="Calibri" w:hAnsi="Calibri"/>
-        </w:rPr>
-        <w:t xml:space="preserve"> elige: usted debe resolverlo con el criterio de desempate de la entidad.</w:t>
+          <w:b/>
+          <w:bCs/>
+        </w:rPr>
+        <w:t xml:space="preserve">Desempate:</w:t>
+      </w:r>
+      <w:r>
+        <w:rPr>
+          <w:rFonts w:ascii="Calibri" w:cs="Calibri" w:eastAsia="Calibri" w:hAnsi="Calibri"/>
+        </w:rPr>
+        <w:t xml:space="preserve"> si dos o más ofertas hábiles tienen </w:t>
+      </w:r>
+      <w:r>
+        <w:rPr>
+          <w:rFonts w:ascii="Calibri" w:cs="Calibri" w:eastAsia="Calibri" w:hAnsi="Calibri"/>
+          <w:b/>
+          <w:bCs/>
+        </w:rPr>
+        <w:t xml:space="preserve">exactamente el mismo precio más bajo</w:t>
+      </w:r>
+      <w:r>
+        <w:rPr>
+          <w:rFonts w:ascii="Calibri" w:cs="Calibri" w:eastAsia="Calibri" w:hAnsi="Calibri"/>
+        </w:rPr>
+        <w:t xml:space="preserve">, el sistema adjudica la recomendación a la que </w:t>
+      </w:r>
+      <w:r>
+        <w:rPr>
+          <w:rFonts w:ascii="Calibri" w:cs="Calibri" w:eastAsia="Calibri" w:hAnsi="Calibri"/>
+          <w:b/>
+          <w:bCs/>
+        </w:rPr>
+        <w:t xml:space="preserve">se recibió primero</w:t>
+      </w:r>
+      <w:r>
+        <w:rPr>
+          <w:rFonts w:ascii="Calibri" w:cs="Calibri" w:eastAsia="Calibri" w:hAnsi="Calibri"/>
+        </w:rPr>
+        <w:t xml:space="preserve"> (fecha y hora de la columna *Recibida*). Si coinciden también en la hora, gana la que se registró antes. El sistema lo avisa en pantalla, lo anota en la auditoría y lo deja escrito en el cuadro comparativo impreso. Por eso conviene registrar con exactitud </w:t>
+      </w:r>
+      <w:r>
+        <w:rPr>
+          <w:rFonts w:ascii="Calibri" w:cs="Calibri" w:eastAsia="Calibri" w:hAnsi="Calibri"/>
+          <w:b/>
+          <w:bCs/>
+        </w:rPr>
+        <w:t xml:space="preserve">Recibida el</w:t>
+      </w:r>
+      <w:r>
+        <w:rPr>
+          <w:rFonts w:ascii="Calibri" w:cs="Calibri" w:eastAsia="Calibri" w:hAnsi="Calibri"/>
+        </w:rPr>
+        <w:t xml:space="preserve"> en cada oferta.</w:t>
       </w:r>
     </w:p>
     <w:p>
@@ -5157,7 +6085,7 @@
           <w:b/>
           <w:bCs/>
         </w:rPr>
-        <w:t xml:space="preserve">Cuadro comparativo (PDF)</w:t>
+        <w:t xml:space="preserve">Imprimir cuadro comparativo (PDF)</w:t>
       </w:r>
       <w:r>
         <w:rPr>
@@ -5492,7 +6420,7 @@
           <w:b/>
           <w:bCs/>
         </w:rPr>
-        <w:t xml:space="preserve">Orden (PDF)</w:t>
+        <w:t xml:space="preserve">Imprimir Orden (PDF)</w:t>
       </w:r>
       <w:r>
         <w:rPr>
@@ -5701,7 +6629,7 @@
           <w:b/>
           <w:bCs/>
         </w:rPr>
-        <w:t xml:space="preserve">Acta de recepción (PDF)</w:t>
+        <w:t xml:space="preserve">Imprimir acta (PDF)</w:t>
       </w:r>
       <w:r>
         <w:rPr>
@@ -8700,9 +9628,9 @@
         </w:tblBorders>
       </w:tblPr>
       <w:tblGrid>
-        <w:gridCol w:w="3600"/>
-        <w:gridCol w:w="2400"/>
-        <w:gridCol w:w="3360"/>
+        <w:gridCol w:w="3284"/>
+        <w:gridCol w:w="2792"/>
+        <w:gridCol w:w="3284"/>
       </w:tblGrid>
       <w:tr>
         <w:trPr>
@@ -8711,7 +9639,7 @@
         </w:trPr>
         <w:tc>
           <w:tcPr>
-            <w:tcW w:type="dxa" w:w="3600"/>
+            <w:tcW w:type="dxa" w:w="3284"/>
             <w:tcBorders>
               <w:top w:val="single" w:color="BFBFBF" w:sz="4"/>
               <w:left w:val="single" w:color="BFBFBF" w:sz="4"/>
@@ -8745,7 +9673,7 @@
         </w:tc>
         <w:tc>
           <w:tcPr>
-            <w:tcW w:type="dxa" w:w="2400"/>
+            <w:tcW w:type="dxa" w:w="2792"/>
             <w:tcBorders>
               <w:top w:val="single" w:color="BFBFBF" w:sz="4"/>
               <w:left w:val="single" w:color="BFBFBF" w:sz="4"/>
@@ -8779,7 +9707,7 @@
         </w:tc>
         <w:tc>
           <w:tcPr>
-            <w:tcW w:type="dxa" w:w="3360"/>
+            <w:tcW w:type="dxa" w:w="3284"/>
             <w:tcBorders>
               <w:top w:val="single" w:color="BFBFBF" w:sz="4"/>
               <w:left w:val="single" w:color="BFBFBF" w:sz="4"/>
@@ -8818,7 +9746,7 @@
         </w:trPr>
         <w:tc>
           <w:tcPr>
-            <w:tcW w:type="dxa" w:w="3600"/>
+            <w:tcW w:type="dxa" w:w="3284"/>
             <w:tcBorders>
               <w:top w:val="single" w:color="BFBFBF" w:sz="4"/>
               <w:left w:val="single" w:color="BFBFBF" w:sz="4"/>
@@ -8848,7 +9776,7 @@
         </w:tc>
         <w:tc>
           <w:tcPr>
-            <w:tcW w:type="dxa" w:w="2400"/>
+            <w:tcW w:type="dxa" w:w="2792"/>
             <w:tcBorders>
               <w:top w:val="single" w:color="BFBFBF" w:sz="4"/>
               <w:left w:val="single" w:color="BFBFBF" w:sz="4"/>
@@ -8878,7 +9806,7 @@
         </w:tc>
         <w:tc>
           <w:tcPr>
-            <w:tcW w:type="dxa" w:w="3360"/>
+            <w:tcW w:type="dxa" w:w="3284"/>
             <w:tcBorders>
               <w:top w:val="single" w:color="BFBFBF" w:sz="4"/>
               <w:left w:val="single" w:color="BFBFBF" w:sz="4"/>
@@ -8913,7 +9841,7 @@
         </w:trPr>
         <w:tc>
           <w:tcPr>
-            <w:tcW w:type="dxa" w:w="3600"/>
+            <w:tcW w:type="dxa" w:w="3284"/>
             <w:tcBorders>
               <w:top w:val="single" w:color="BFBFBF" w:sz="4"/>
               <w:left w:val="single" w:color="BFBFBF" w:sz="4"/>
@@ -8943,7 +9871,7 @@
         </w:tc>
         <w:tc>
           <w:tcPr>
-            <w:tcW w:type="dxa" w:w="2400"/>
+            <w:tcW w:type="dxa" w:w="2792"/>
             <w:tcBorders>
               <w:top w:val="single" w:color="BFBFBF" w:sz="4"/>
               <w:left w:val="single" w:color="BFBFBF" w:sz="4"/>
@@ -8973,7 +9901,7 @@
         </w:tc>
         <w:tc>
           <w:tcPr>
-            <w:tcW w:type="dxa" w:w="3360"/>
+            <w:tcW w:type="dxa" w:w="3284"/>
             <w:tcBorders>
               <w:top w:val="single" w:color="BFBFBF" w:sz="4"/>
               <w:left w:val="single" w:color="BFBFBF" w:sz="4"/>
@@ -9008,7 +9936,7 @@
         </w:trPr>
         <w:tc>
           <w:tcPr>
-            <w:tcW w:type="dxa" w:w="3600"/>
+            <w:tcW w:type="dxa" w:w="3284"/>
             <w:tcBorders>
               <w:top w:val="single" w:color="BFBFBF" w:sz="4"/>
               <w:left w:val="single" w:color="BFBFBF" w:sz="4"/>
@@ -9038,7 +9966,7 @@
         </w:tc>
         <w:tc>
           <w:tcPr>
-            <w:tcW w:type="dxa" w:w="2400"/>
+            <w:tcW w:type="dxa" w:w="2792"/>
             <w:tcBorders>
               <w:top w:val="single" w:color="BFBFBF" w:sz="4"/>
               <w:left w:val="single" w:color="BFBFBF" w:sz="4"/>
@@ -9068,7 +9996,7 @@
         </w:tc>
         <w:tc>
           <w:tcPr>
-            <w:tcW w:type="dxa" w:w="3360"/>
+            <w:tcW w:type="dxa" w:w="3284"/>
             <w:tcBorders>
               <w:top w:val="single" w:color="BFBFBF" w:sz="4"/>
               <w:left w:val="single" w:color="BFBFBF" w:sz="4"/>
@@ -9103,7 +10031,7 @@
         </w:trPr>
         <w:tc>
           <w:tcPr>
-            <w:tcW w:type="dxa" w:w="3600"/>
+            <w:tcW w:type="dxa" w:w="3284"/>
             <w:tcBorders>
               <w:top w:val="single" w:color="BFBFBF" w:sz="4"/>
               <w:left w:val="single" w:color="BFBFBF" w:sz="4"/>
@@ -9133,7 +10061,7 @@
         </w:tc>
         <w:tc>
           <w:tcPr>
-            <w:tcW w:type="dxa" w:w="2400"/>
+            <w:tcW w:type="dxa" w:w="2792"/>
             <w:tcBorders>
               <w:top w:val="single" w:color="BFBFBF" w:sz="4"/>
               <w:left w:val="single" w:color="BFBFBF" w:sz="4"/>
@@ -9163,7 +10091,7 @@
         </w:tc>
         <w:tc>
           <w:tcPr>
-            <w:tcW w:type="dxa" w:w="3360"/>
+            <w:tcW w:type="dxa" w:w="3284"/>
             <w:tcBorders>
               <w:top w:val="single" w:color="BFBFBF" w:sz="4"/>
               <w:left w:val="single" w:color="BFBFBF" w:sz="4"/>
@@ -9198,7 +10126,7 @@
         </w:trPr>
         <w:tc>
           <w:tcPr>
-            <w:tcW w:type="dxa" w:w="3600"/>
+            <w:tcW w:type="dxa" w:w="3284"/>
             <w:tcBorders>
               <w:top w:val="single" w:color="BFBFBF" w:sz="4"/>
               <w:left w:val="single" w:color="BFBFBF" w:sz="4"/>
@@ -9228,7 +10156,7 @@
         </w:tc>
         <w:tc>
           <w:tcPr>
-            <w:tcW w:type="dxa" w:w="2400"/>
+            <w:tcW w:type="dxa" w:w="2792"/>
             <w:tcBorders>
               <w:top w:val="single" w:color="BFBFBF" w:sz="4"/>
               <w:left w:val="single" w:color="BFBFBF" w:sz="4"/>
@@ -9258,7 +10186,7 @@
         </w:tc>
         <w:tc>
           <w:tcPr>
-            <w:tcW w:type="dxa" w:w="3360"/>
+            <w:tcW w:type="dxa" w:w="3284"/>
             <w:tcBorders>
               <w:top w:val="single" w:color="BFBFBF" w:sz="4"/>
               <w:left w:val="single" w:color="BFBFBF" w:sz="4"/>
@@ -9293,7 +10221,7 @@
         </w:trPr>
         <w:tc>
           <w:tcPr>
-            <w:tcW w:type="dxa" w:w="3600"/>
+            <w:tcW w:type="dxa" w:w="3284"/>
             <w:tcBorders>
               <w:top w:val="single" w:color="BFBFBF" w:sz="4"/>
               <w:left w:val="single" w:color="BFBFBF" w:sz="4"/>
@@ -9323,7 +10251,7 @@
         </w:tc>
         <w:tc>
           <w:tcPr>
-            <w:tcW w:type="dxa" w:w="2400"/>
+            <w:tcW w:type="dxa" w:w="2792"/>
             <w:tcBorders>
               <w:top w:val="single" w:color="BFBFBF" w:sz="4"/>
               <w:left w:val="single" w:color="BFBFBF" w:sz="4"/>
@@ -9353,7 +10281,7 @@
         </w:tc>
         <w:tc>
           <w:tcPr>
-            <w:tcW w:type="dxa" w:w="3360"/>
+            <w:tcW w:type="dxa" w:w="3284"/>
             <w:tcBorders>
               <w:top w:val="single" w:color="BFBFBF" w:sz="4"/>
               <w:left w:val="single" w:color="BFBFBF" w:sz="4"/>
@@ -9388,7 +10316,7 @@
         </w:trPr>
         <w:tc>
           <w:tcPr>
-            <w:tcW w:type="dxa" w:w="3600"/>
+            <w:tcW w:type="dxa" w:w="3284"/>
             <w:tcBorders>
               <w:top w:val="single" w:color="BFBFBF" w:sz="4"/>
               <w:left w:val="single" w:color="BFBFBF" w:sz="4"/>
@@ -9418,7 +10346,7 @@
         </w:tc>
         <w:tc>
           <w:tcPr>
-            <w:tcW w:type="dxa" w:w="2400"/>
+            <w:tcW w:type="dxa" w:w="2792"/>
             <w:tcBorders>
               <w:top w:val="single" w:color="BFBFBF" w:sz="4"/>
               <w:left w:val="single" w:color="BFBFBF" w:sz="4"/>
@@ -9448,7 +10376,7 @@
         </w:tc>
         <w:tc>
           <w:tcPr>
-            <w:tcW w:type="dxa" w:w="3360"/>
+            <w:tcW w:type="dxa" w:w="3284"/>
             <w:tcBorders>
               <w:top w:val="single" w:color="BFBFBF" w:sz="4"/>
               <w:left w:val="single" w:color="BFBFBF" w:sz="4"/>
@@ -9483,7 +10411,7 @@
         </w:trPr>
         <w:tc>
           <w:tcPr>
-            <w:tcW w:type="dxa" w:w="3600"/>
+            <w:tcW w:type="dxa" w:w="3284"/>
             <w:tcBorders>
               <w:top w:val="single" w:color="BFBFBF" w:sz="4"/>
               <w:left w:val="single" w:color="BFBFBF" w:sz="4"/>
@@ -9513,7 +10441,7 @@
         </w:tc>
         <w:tc>
           <w:tcPr>
-            <w:tcW w:type="dxa" w:w="2400"/>
+            <w:tcW w:type="dxa" w:w="2792"/>
             <w:tcBorders>
               <w:top w:val="single" w:color="BFBFBF" w:sz="4"/>
               <w:left w:val="single" w:color="BFBFBF" w:sz="4"/>
@@ -9543,7 +10471,7 @@
         </w:tc>
         <w:tc>
           <w:tcPr>
-            <w:tcW w:type="dxa" w:w="3360"/>
+            <w:tcW w:type="dxa" w:w="3284"/>
             <w:tcBorders>
               <w:top w:val="single" w:color="BFBFBF" w:sz="4"/>
               <w:left w:val="single" w:color="BFBFBF" w:sz="4"/>
@@ -9578,7 +10506,7 @@
         </w:trPr>
         <w:tc>
           <w:tcPr>
-            <w:tcW w:type="dxa" w:w="3600"/>
+            <w:tcW w:type="dxa" w:w="3284"/>
             <w:tcBorders>
               <w:top w:val="single" w:color="BFBFBF" w:sz="4"/>
               <w:left w:val="single" w:color="BFBFBF" w:sz="4"/>
@@ -9608,7 +10536,7 @@
         </w:tc>
         <w:tc>
           <w:tcPr>
-            <w:tcW w:type="dxa" w:w="2400"/>
+            <w:tcW w:type="dxa" w:w="2792"/>
             <w:tcBorders>
               <w:top w:val="single" w:color="BFBFBF" w:sz="4"/>
               <w:left w:val="single" w:color="BFBFBF" w:sz="4"/>
@@ -9638,7 +10566,7 @@
         </w:tc>
         <w:tc>
           <w:tcPr>
-            <w:tcW w:type="dxa" w:w="3360"/>
+            <w:tcW w:type="dxa" w:w="3284"/>
             <w:tcBorders>
               <w:top w:val="single" w:color="BFBFBF" w:sz="4"/>
               <w:left w:val="single" w:color="BFBFBF" w:sz="4"/>
@@ -9673,91 +10601,91 @@
         </w:trPr>
         <w:tc>
           <w:tcPr>
-            <w:tcW w:type="dxa" w:w="3600"/>
-            <w:tcBorders>
-              <w:top w:val="single" w:color="BFBFBF" w:sz="4"/>
-              <w:left w:val="single" w:color="BFBFBF" w:sz="4"/>
-              <w:bottom w:val="single" w:color="BFBFBF" w:sz="4"/>
-              <w:right w:val="single" w:color="BFBFBF" w:sz="4"/>
-            </w:tcBorders>
-            <w:tcMar>
-              <w:top w:type="dxa" w:w="60"/>
-              <w:left w:type="dxa" w:w="100"/>
-              <w:bottom w:type="dxa" w:w="60"/>
-              <w:right w:type="dxa" w:w="100"/>
-            </w:tcMar>
-          </w:tcPr>
-          <w:p>
-            <w:pPr>
-              <w:spacing w:after="0"/>
-            </w:pPr>
-            <w:r>
-              <w:rPr>
-                <w:rFonts w:ascii="Calibri" w:cs="Calibri" w:eastAsia="Calibri" w:hAnsi="Calibri"/>
-                <w:sz w:val="19"/>
-                <w:szCs w:val="19"/>
-              </w:rPr>
-              <w:t xml:space="preserve">EMPATE en precio mas bajo</w:t>
-            </w:r>
-          </w:p>
-        </w:tc>
-        <w:tc>
-          <w:tcPr>
-            <w:tcW w:type="dxa" w:w="2400"/>
-            <w:tcBorders>
-              <w:top w:val="single" w:color="BFBFBF" w:sz="4"/>
-              <w:left w:val="single" w:color="BFBFBF" w:sz="4"/>
-              <w:bottom w:val="single" w:color="BFBFBF" w:sz="4"/>
-              <w:right w:val="single" w:color="BFBFBF" w:sz="4"/>
-            </w:tcBorders>
-            <w:tcMar>
-              <w:top w:type="dxa" w:w="60"/>
-              <w:left w:type="dxa" w:w="100"/>
-              <w:bottom w:type="dxa" w:w="60"/>
-              <w:right w:type="dxa" w:w="100"/>
-            </w:tcMar>
-          </w:tcPr>
-          <w:p>
-            <w:pPr>
-              <w:spacing w:after="0"/>
-            </w:pPr>
-            <w:r>
-              <w:rPr>
-                <w:rFonts w:ascii="Calibri" w:cs="Calibri" w:eastAsia="Calibri" w:hAnsi="Calibri"/>
-                <w:sz w:val="19"/>
-                <w:szCs w:val="19"/>
-              </w:rPr>
-              <w:t xml:space="preserve">Dos ofertas con el mismo monto</w:t>
-            </w:r>
-          </w:p>
-        </w:tc>
-        <w:tc>
-          <w:tcPr>
-            <w:tcW w:type="dxa" w:w="3360"/>
-            <w:tcBorders>
-              <w:top w:val="single" w:color="BFBFBF" w:sz="4"/>
-              <w:left w:val="single" w:color="BFBFBF" w:sz="4"/>
-              <w:bottom w:val="single" w:color="BFBFBF" w:sz="4"/>
-              <w:right w:val="single" w:color="BFBFBF" w:sz="4"/>
-            </w:tcBorders>
-            <w:tcMar>
-              <w:top w:type="dxa" w:w="60"/>
-              <w:left w:type="dxa" w:w="100"/>
-              <w:bottom w:type="dxa" w:w="60"/>
-              <w:right w:type="dxa" w:w="100"/>
-            </w:tcMar>
-          </w:tcPr>
-          <w:p>
-            <w:pPr>
-              <w:spacing w:after="0"/>
-            </w:pPr>
-            <w:r>
-              <w:rPr>
-                <w:rFonts w:ascii="Calibri" w:cs="Calibri" w:eastAsia="Calibri" w:hAnsi="Calibri"/>
-                <w:sz w:val="19"/>
-                <w:szCs w:val="19"/>
-              </w:rPr>
-              <w:t xml:space="preserve">Resuelva con el criterio de desempate</w:t>
+            <w:tcW w:type="dxa" w:w="3284"/>
+            <w:tcBorders>
+              <w:top w:val="single" w:color="BFBFBF" w:sz="4"/>
+              <w:left w:val="single" w:color="BFBFBF" w:sz="4"/>
+              <w:bottom w:val="single" w:color="BFBFBF" w:sz="4"/>
+              <w:right w:val="single" w:color="BFBFBF" w:sz="4"/>
+            </w:tcBorders>
+            <w:tcMar>
+              <w:top w:type="dxa" w:w="60"/>
+              <w:left w:type="dxa" w:w="100"/>
+              <w:bottom w:type="dxa" w:w="60"/>
+              <w:right w:type="dxa" w:w="100"/>
+            </w:tcMar>
+          </w:tcPr>
+          <w:p>
+            <w:pPr>
+              <w:spacing w:after="0"/>
+            </w:pPr>
+            <w:r>
+              <w:rPr>
+                <w:rFonts w:ascii="Calibri" w:cs="Calibri" w:eastAsia="Calibri" w:hAnsi="Calibri"/>
+                <w:sz w:val="19"/>
+                <w:szCs w:val="19"/>
+              </w:rPr>
+              <w:t xml:space="preserve">Hubo N ofertas con el mismo precio: se desempató por PRIMERA RECEPCION</w:t>
+            </w:r>
+          </w:p>
+        </w:tc>
+        <w:tc>
+          <w:tcPr>
+            <w:tcW w:type="dxa" w:w="2792"/>
+            <w:tcBorders>
+              <w:top w:val="single" w:color="BFBFBF" w:sz="4"/>
+              <w:left w:val="single" w:color="BFBFBF" w:sz="4"/>
+              <w:bottom w:val="single" w:color="BFBFBF" w:sz="4"/>
+              <w:right w:val="single" w:color="BFBFBF" w:sz="4"/>
+            </w:tcBorders>
+            <w:tcMar>
+              <w:top w:type="dxa" w:w="60"/>
+              <w:left w:type="dxa" w:w="100"/>
+              <w:bottom w:type="dxa" w:w="60"/>
+              <w:right w:type="dxa" w:w="100"/>
+            </w:tcMar>
+          </w:tcPr>
+          <w:p>
+            <w:pPr>
+              <w:spacing w:after="0"/>
+            </w:pPr>
+            <w:r>
+              <w:rPr>
+                <w:rFonts w:ascii="Calibri" w:cs="Calibri" w:eastAsia="Calibri" w:hAnsi="Calibri"/>
+                <w:sz w:val="19"/>
+                <w:szCs w:val="19"/>
+              </w:rPr>
+              <w:t xml:space="preserve">Aviso informativo: ofertas hábiles con igual precio</w:t>
+            </w:r>
+          </w:p>
+        </w:tc>
+        <w:tc>
+          <w:tcPr>
+            <w:tcW w:type="dxa" w:w="3284"/>
+            <w:tcBorders>
+              <w:top w:val="single" w:color="BFBFBF" w:sz="4"/>
+              <w:left w:val="single" w:color="BFBFBF" w:sz="4"/>
+              <w:bottom w:val="single" w:color="BFBFBF" w:sz="4"/>
+              <w:right w:val="single" w:color="BFBFBF" w:sz="4"/>
+            </w:tcBorders>
+            <w:tcMar>
+              <w:top w:type="dxa" w:w="60"/>
+              <w:left w:type="dxa" w:w="100"/>
+              <w:bottom w:type="dxa" w:w="60"/>
+              <w:right w:type="dxa" w:w="100"/>
+            </w:tcMar>
+          </w:tcPr>
+          <w:p>
+            <w:pPr>
+              <w:spacing w:after="0"/>
+            </w:pPr>
+            <w:r>
+              <w:rPr>
+                <w:rFonts w:ascii="Calibri" w:cs="Calibri" w:eastAsia="Calibri" w:hAnsi="Calibri"/>
+                <w:sz w:val="19"/>
+                <w:szCs w:val="19"/>
+              </w:rPr>
+              <w:t xml:space="preserve">Verifique las fechas y horas de recepción; el cuadro impreso lo explica</w:t>
             </w:r>
           </w:p>
         </w:tc>
@@ -9768,91 +10696,101 @@
         </w:trPr>
         <w:tc>
           <w:tcPr>
-            <w:tcW w:type="dxa" w:w="3600"/>
-            <w:tcBorders>
-              <w:top w:val="single" w:color="BFBFBF" w:sz="4"/>
-              <w:left w:val="single" w:color="BFBFBF" w:sz="4"/>
-              <w:bottom w:val="single" w:color="BFBFBF" w:sz="4"/>
-              <w:right w:val="single" w:color="BFBFBF" w:sz="4"/>
-            </w:tcBorders>
-            <w:tcMar>
-              <w:top w:type="dxa" w:w="60"/>
-              <w:left w:type="dxa" w:w="100"/>
-              <w:bottom w:type="dxa" w:w="60"/>
-              <w:right w:type="dxa" w:w="100"/>
-            </w:tcMar>
-          </w:tcPr>
-          <w:p>
-            <w:pPr>
-              <w:spacing w:after="0"/>
-            </w:pPr>
-            <w:r>
-              <w:rPr>
-                <w:rFonts w:ascii="Calibri" w:cs="Calibri" w:eastAsia="Calibri" w:hAnsi="Calibri"/>
-                <w:sz w:val="19"/>
-                <w:szCs w:val="19"/>
-              </w:rPr>
-              <w:t xml:space="preserve">Bloqueado por CHB</w:t>
-            </w:r>
-          </w:p>
-        </w:tc>
-        <w:tc>
-          <w:tcPr>
-            <w:tcW w:type="dxa" w:w="2400"/>
-            <w:tcBorders>
-              <w:top w:val="single" w:color="BFBFBF" w:sz="4"/>
-              <w:left w:val="single" w:color="BFBFBF" w:sz="4"/>
-              <w:bottom w:val="single" w:color="BFBFBF" w:sz="4"/>
-              <w:right w:val="single" w:color="BFBFBF" w:sz="4"/>
-            </w:tcBorders>
-            <w:tcMar>
-              <w:top w:type="dxa" w:w="60"/>
-              <w:left w:type="dxa" w:w="100"/>
-              <w:bottom w:type="dxa" w:w="60"/>
-              <w:right w:type="dxa" w:w="100"/>
-            </w:tcMar>
-          </w:tcPr>
-          <w:p>
-            <w:pPr>
-              <w:spacing w:after="0"/>
-            </w:pPr>
-            <w:r>
-              <w:rPr>
-                <w:rFonts w:ascii="Calibri" w:cs="Calibri" w:eastAsia="Calibri" w:hAnsi="Calibri"/>
-                <w:sz w:val="19"/>
-                <w:szCs w:val="19"/>
-              </w:rPr>
-              <w:t xml:space="preserve">Hay ítems sin ficha vigente ni excepción</w:t>
-            </w:r>
-          </w:p>
-        </w:tc>
-        <w:tc>
-          <w:tcPr>
-            <w:tcW w:type="dxa" w:w="3360"/>
-            <w:tcBorders>
-              <w:top w:val="single" w:color="BFBFBF" w:sz="4"/>
-              <w:left w:val="single" w:color="BFBFBF" w:sz="4"/>
-              <w:bottom w:val="single" w:color="BFBFBF" w:sz="4"/>
-              <w:right w:val="single" w:color="BFBFBF" w:sz="4"/>
-            </w:tcBorders>
-            <w:tcMar>
-              <w:top w:type="dxa" w:w="60"/>
-              <w:left w:type="dxa" w:w="100"/>
-              <w:bottom w:type="dxa" w:w="60"/>
-              <w:right w:type="dxa" w:w="100"/>
-            </w:tcMar>
-          </w:tcPr>
-          <w:p>
-            <w:pPr>
-              <w:spacing w:after="0"/>
-            </w:pPr>
-            <w:r>
-              <w:rPr>
-                <w:rFonts w:ascii="Calibri" w:cs="Calibri" w:eastAsia="Calibri" w:hAnsi="Calibri"/>
-                <w:sz w:val="19"/>
-                <w:szCs w:val="19"/>
-              </w:rPr>
-              <w:t xml:space="preserve">Complete la pestaña 2</w:t>
+            <w:tcW w:type="dxa" w:w="3284"/>
+            <w:tcBorders>
+              <w:top w:val="single" w:color="BFBFBF" w:sz="4"/>
+              <w:left w:val="single" w:color="BFBFBF" w:sz="4"/>
+              <w:bottom w:val="single" w:color="BFBFBF" w:sz="4"/>
+              <w:right w:val="single" w:color="BFBFBF" w:sz="4"/>
+            </w:tcBorders>
+            <w:tcMar>
+              <w:top w:type="dxa" w:w="60"/>
+              <w:left w:type="dxa" w:w="100"/>
+              <w:bottom w:type="dxa" w:w="60"/>
+              <w:right w:type="dxa" w:w="100"/>
+            </w:tcMar>
+          </w:tcPr>
+          <w:p>
+            <w:pPr>
+              <w:spacing w:after="0"/>
+            </w:pPr>
+            <w:r>
+              <w:rPr>
+                <w:rFonts w:ascii="Calibri" w:cs="Calibri" w:eastAsia="Calibri" w:hAnsi="Calibri"/>
+                <w:sz w:val="19"/>
+                <w:szCs w:val="19"/>
+              </w:rPr>
+              <w:t xml:space="preserve">La fecha y hora de recepcion de la oferta no puede ser futura</w:t>
+            </w:r>
+          </w:p>
+        </w:tc>
+        <w:tc>
+          <w:tcPr>
+            <w:tcW w:type="dxa" w:w="2792"/>
+            <w:tcBorders>
+              <w:top w:val="single" w:color="BFBFBF" w:sz="4"/>
+              <w:left w:val="single" w:color="BFBFBF" w:sz="4"/>
+              <w:bottom w:val="single" w:color="BFBFBF" w:sz="4"/>
+              <w:right w:val="single" w:color="BFBFBF" w:sz="4"/>
+            </w:tcBorders>
+            <w:tcMar>
+              <w:top w:type="dxa" w:w="60"/>
+              <w:left w:type="dxa" w:w="100"/>
+              <w:bottom w:type="dxa" w:w="60"/>
+              <w:right w:type="dxa" w:w="100"/>
+            </w:tcMar>
+          </w:tcPr>
+          <w:p>
+            <w:pPr>
+              <w:spacing w:after="0"/>
+            </w:pPr>
+            <w:r>
+              <w:rPr>
+                <w:rFonts w:ascii="Calibri" w:cs="Calibri" w:eastAsia="Calibri" w:hAnsi="Calibri"/>
+                <w:sz w:val="19"/>
+                <w:szCs w:val="19"/>
+              </w:rPr>
+              <w:t xml:space="preserve">Escribió una fecha posterior a ahora</w:t>
+            </w:r>
+          </w:p>
+        </w:tc>
+        <w:tc>
+          <w:tcPr>
+            <w:tcW w:type="dxa" w:w="3284"/>
+            <w:tcBorders>
+              <w:top w:val="single" w:color="BFBFBF" w:sz="4"/>
+              <w:left w:val="single" w:color="BFBFBF" w:sz="4"/>
+              <w:bottom w:val="single" w:color="BFBFBF" w:sz="4"/>
+              <w:right w:val="single" w:color="BFBFBF" w:sz="4"/>
+            </w:tcBorders>
+            <w:tcMar>
+              <w:top w:type="dxa" w:w="60"/>
+              <w:left w:type="dxa" w:w="100"/>
+              <w:bottom w:type="dxa" w:w="60"/>
+              <w:right w:type="dxa" w:w="100"/>
+            </w:tcMar>
+          </w:tcPr>
+          <w:p>
+            <w:pPr>
+              <w:spacing w:after="0"/>
+            </w:pPr>
+            <w:r>
+              <w:rPr>
+                <w:rFonts w:ascii="Calibri" w:cs="Calibri" w:eastAsia="Calibri" w:hAnsi="Calibri"/>
+                <w:sz w:val="19"/>
+                <w:szCs w:val="19"/>
+              </w:rPr>
+              <w:t xml:space="preserve">Corrija </w:t>
+            </w:r>
+            <w:r>
+              <w:rPr>
+                <w:rFonts w:ascii="Calibri" w:cs="Calibri" w:eastAsia="Calibri" w:hAnsi="Calibri"/>
+                <w:b/>
+                <w:bCs/>
+                <w:sz w:val="19"/>
+                <w:szCs w:val="19"/>
+              </w:rPr>
+              <w:t xml:space="preserve">Recibida el</w:t>
             </w:r>
           </w:p>
         </w:tc>
@@ -9863,91 +10801,91 @@
         </w:trPr>
         <w:tc>
           <w:tcPr>
-            <w:tcW w:type="dxa" w:w="3600"/>
-            <w:tcBorders>
-              <w:top w:val="single" w:color="BFBFBF" w:sz="4"/>
-              <w:left w:val="single" w:color="BFBFBF" w:sz="4"/>
-              <w:bottom w:val="single" w:color="BFBFBF" w:sz="4"/>
-              <w:right w:val="single" w:color="BFBFBF" w:sz="4"/>
-            </w:tcBorders>
-            <w:tcMar>
-              <w:top w:type="dxa" w:w="60"/>
-              <w:left w:type="dxa" w:w="100"/>
-              <w:bottom w:type="dxa" w:w="60"/>
-              <w:right w:type="dxa" w:w="100"/>
-            </w:tcMar>
-          </w:tcPr>
-          <w:p>
-            <w:pPr>
-              <w:spacing w:after="0"/>
-            </w:pPr>
-            <w:r>
-              <w:rPr>
-                <w:rFonts w:ascii="Calibri" w:cs="Calibri" w:eastAsia="Calibri" w:hAnsi="Calibri"/>
-                <w:sz w:val="19"/>
-                <w:szCs w:val="19"/>
-              </w:rPr>
-              <w:t xml:space="preserve">Saldo insuficiente en partida X</w:t>
-            </w:r>
-          </w:p>
-        </w:tc>
-        <w:tc>
-          <w:tcPr>
-            <w:tcW w:type="dxa" w:w="2400"/>
-            <w:tcBorders>
-              <w:top w:val="single" w:color="BFBFBF" w:sz="4"/>
-              <w:left w:val="single" w:color="BFBFBF" w:sz="4"/>
-              <w:bottom w:val="single" w:color="BFBFBF" w:sz="4"/>
-              <w:right w:val="single" w:color="BFBFBF" w:sz="4"/>
-            </w:tcBorders>
-            <w:tcMar>
-              <w:top w:type="dxa" w:w="60"/>
-              <w:left w:type="dxa" w:w="100"/>
-              <w:bottom w:type="dxa" w:w="60"/>
-              <w:right w:type="dxa" w:w="100"/>
-            </w:tcMar>
-          </w:tcPr>
-          <w:p>
-            <w:pPr>
-              <w:spacing w:after="0"/>
-            </w:pPr>
-            <w:r>
-              <w:rPr>
-                <w:rFonts w:ascii="Calibri" w:cs="Calibri" w:eastAsia="Calibri" w:hAnsi="Calibri"/>
-                <w:sz w:val="19"/>
-                <w:szCs w:val="19"/>
-              </w:rPr>
-              <w:t xml:space="preserve">La partida no alcanza</w:t>
-            </w:r>
-          </w:p>
-        </w:tc>
-        <w:tc>
-          <w:tcPr>
-            <w:tcW w:type="dxa" w:w="3360"/>
-            <w:tcBorders>
-              <w:top w:val="single" w:color="BFBFBF" w:sz="4"/>
-              <w:left w:val="single" w:color="BFBFBF" w:sz="4"/>
-              <w:bottom w:val="single" w:color="BFBFBF" w:sz="4"/>
-              <w:right w:val="single" w:color="BFBFBF" w:sz="4"/>
-            </w:tcBorders>
-            <w:tcMar>
-              <w:top w:type="dxa" w:w="60"/>
-              <w:left w:type="dxa" w:w="100"/>
-              <w:bottom w:type="dxa" w:w="60"/>
-              <w:right w:type="dxa" w:w="100"/>
-            </w:tcMar>
-          </w:tcPr>
-          <w:p>
-            <w:pPr>
-              <w:spacing w:after="0"/>
-            </w:pPr>
-            <w:r>
-              <w:rPr>
-                <w:rFonts w:ascii="Calibri" w:cs="Calibri" w:eastAsia="Calibri" w:hAnsi="Calibri"/>
-                <w:sz w:val="19"/>
-                <w:szCs w:val="19"/>
-              </w:rPr>
-              <w:t xml:space="preserve">Cambie la partida o gestione modificación presupuestaria</w:t>
+            <w:tcW w:type="dxa" w:w="3284"/>
+            <w:tcBorders>
+              <w:top w:val="single" w:color="BFBFBF" w:sz="4"/>
+              <w:left w:val="single" w:color="BFBFBF" w:sz="4"/>
+              <w:bottom w:val="single" w:color="BFBFBF" w:sz="4"/>
+              <w:right w:val="single" w:color="BFBFBF" w:sz="4"/>
+            </w:tcBorders>
+            <w:tcMar>
+              <w:top w:type="dxa" w:w="60"/>
+              <w:left w:type="dxa" w:w="100"/>
+              <w:bottom w:type="dxa" w:w="60"/>
+              <w:right w:type="dxa" w:w="100"/>
+            </w:tcMar>
+          </w:tcPr>
+          <w:p>
+            <w:pPr>
+              <w:spacing w:after="0"/>
+            </w:pPr>
+            <w:r>
+              <w:rPr>
+                <w:rFonts w:ascii="Calibri" w:cs="Calibri" w:eastAsia="Calibri" w:hAnsi="Calibri"/>
+                <w:sz w:val="19"/>
+                <w:szCs w:val="19"/>
+              </w:rPr>
+              <w:t xml:space="preserve">Bloqueado por CHB</w:t>
+            </w:r>
+          </w:p>
+        </w:tc>
+        <w:tc>
+          <w:tcPr>
+            <w:tcW w:type="dxa" w:w="2792"/>
+            <w:tcBorders>
+              <w:top w:val="single" w:color="BFBFBF" w:sz="4"/>
+              <w:left w:val="single" w:color="BFBFBF" w:sz="4"/>
+              <w:bottom w:val="single" w:color="BFBFBF" w:sz="4"/>
+              <w:right w:val="single" w:color="BFBFBF" w:sz="4"/>
+            </w:tcBorders>
+            <w:tcMar>
+              <w:top w:type="dxa" w:w="60"/>
+              <w:left w:type="dxa" w:w="100"/>
+              <w:bottom w:type="dxa" w:w="60"/>
+              <w:right w:type="dxa" w:w="100"/>
+            </w:tcMar>
+          </w:tcPr>
+          <w:p>
+            <w:pPr>
+              <w:spacing w:after="0"/>
+            </w:pPr>
+            <w:r>
+              <w:rPr>
+                <w:rFonts w:ascii="Calibri" w:cs="Calibri" w:eastAsia="Calibri" w:hAnsi="Calibri"/>
+                <w:sz w:val="19"/>
+                <w:szCs w:val="19"/>
+              </w:rPr>
+              <w:t xml:space="preserve">Hay ítems sin ficha vigente ni excepción</w:t>
+            </w:r>
+          </w:p>
+        </w:tc>
+        <w:tc>
+          <w:tcPr>
+            <w:tcW w:type="dxa" w:w="3284"/>
+            <w:tcBorders>
+              <w:top w:val="single" w:color="BFBFBF" w:sz="4"/>
+              <w:left w:val="single" w:color="BFBFBF" w:sz="4"/>
+              <w:bottom w:val="single" w:color="BFBFBF" w:sz="4"/>
+              <w:right w:val="single" w:color="BFBFBF" w:sz="4"/>
+            </w:tcBorders>
+            <w:tcMar>
+              <w:top w:type="dxa" w:w="60"/>
+              <w:left w:type="dxa" w:w="100"/>
+              <w:bottom w:type="dxa" w:w="60"/>
+              <w:right w:type="dxa" w:w="100"/>
+            </w:tcMar>
+          </w:tcPr>
+          <w:p>
+            <w:pPr>
+              <w:spacing w:after="0"/>
+            </w:pPr>
+            <w:r>
+              <w:rPr>
+                <w:rFonts w:ascii="Calibri" w:cs="Calibri" w:eastAsia="Calibri" w:hAnsi="Calibri"/>
+                <w:sz w:val="19"/>
+                <w:szCs w:val="19"/>
+              </w:rPr>
+              <w:t xml:space="preserve">Complete la pestaña 2</w:t>
             </w:r>
           </w:p>
         </w:tc>
@@ -9958,91 +10896,91 @@
         </w:trPr>
         <w:tc>
           <w:tcPr>
-            <w:tcW w:type="dxa" w:w="3600"/>
-            <w:tcBorders>
-              <w:top w:val="single" w:color="BFBFBF" w:sz="4"/>
-              <w:left w:val="single" w:color="BFBFBF" w:sz="4"/>
-              <w:bottom w:val="single" w:color="BFBFBF" w:sz="4"/>
-              <w:right w:val="single" w:color="BFBFBF" w:sz="4"/>
-            </w:tcBorders>
-            <w:tcMar>
-              <w:top w:type="dxa" w:w="60"/>
-              <w:left w:type="dxa" w:w="100"/>
-              <w:bottom w:type="dxa" w:w="60"/>
-              <w:right w:type="dxa" w:w="100"/>
-            </w:tcMar>
-          </w:tcPr>
-          <w:p>
-            <w:pPr>
-              <w:spacing w:after="0"/>
-            </w:pPr>
-            <w:r>
-              <w:rPr>
-                <w:rFonts w:ascii="Calibri" w:cs="Calibri" w:eastAsia="Calibri" w:hAnsi="Calibri"/>
-                <w:sz w:val="19"/>
-                <w:szCs w:val="19"/>
-              </w:rPr>
-              <w:t xml:space="preserve">La estructura programatica no existe en el presupuesto</w:t>
-            </w:r>
-          </w:p>
-        </w:tc>
-        <w:tc>
-          <w:tcPr>
-            <w:tcW w:type="dxa" w:w="2400"/>
-            <w:tcBorders>
-              <w:top w:val="single" w:color="BFBFBF" w:sz="4"/>
-              <w:left w:val="single" w:color="BFBFBF" w:sz="4"/>
-              <w:bottom w:val="single" w:color="BFBFBF" w:sz="4"/>
-              <w:right w:val="single" w:color="BFBFBF" w:sz="4"/>
-            </w:tcBorders>
-            <w:tcMar>
-              <w:top w:type="dxa" w:w="60"/>
-              <w:left w:type="dxa" w:w="100"/>
-              <w:bottom w:type="dxa" w:w="60"/>
-              <w:right w:type="dxa" w:w="100"/>
-            </w:tcMar>
-          </w:tcPr>
-          <w:p>
-            <w:pPr>
-              <w:spacing w:after="0"/>
-            </w:pPr>
-            <w:r>
-              <w:rPr>
-                <w:rFonts w:ascii="Calibri" w:cs="Calibri" w:eastAsia="Calibri" w:hAnsi="Calibri"/>
-                <w:sz w:val="19"/>
-                <w:szCs w:val="19"/>
-              </w:rPr>
-              <w:t xml:space="preserve">Algún código no coincide</w:t>
-            </w:r>
-          </w:p>
-        </w:tc>
-        <w:tc>
-          <w:tcPr>
-            <w:tcW w:type="dxa" w:w="3360"/>
-            <w:tcBorders>
-              <w:top w:val="single" w:color="BFBFBF" w:sz="4"/>
-              <w:left w:val="single" w:color="BFBFBF" w:sz="4"/>
-              <w:bottom w:val="single" w:color="BFBFBF" w:sz="4"/>
-              <w:right w:val="single" w:color="BFBFBF" w:sz="4"/>
-            </w:tcBorders>
-            <w:tcMar>
-              <w:top w:type="dxa" w:w="60"/>
-              <w:left w:type="dxa" w:w="100"/>
-              <w:bottom w:type="dxa" w:w="60"/>
-              <w:right w:type="dxa" w:w="100"/>
-            </w:tcMar>
-          </w:tcPr>
-          <w:p>
-            <w:pPr>
-              <w:spacing w:after="0"/>
-            </w:pPr>
-            <w:r>
-              <w:rPr>
-                <w:rFonts w:ascii="Calibri" w:cs="Calibri" w:eastAsia="Calibri" w:hAnsi="Calibri"/>
-                <w:sz w:val="19"/>
-                <w:szCs w:val="19"/>
-              </w:rPr>
-              <w:t xml:space="preserve">Revise los códigos con el presupuesto</w:t>
+            <w:tcW w:type="dxa" w:w="3284"/>
+            <w:tcBorders>
+              <w:top w:val="single" w:color="BFBFBF" w:sz="4"/>
+              <w:left w:val="single" w:color="BFBFBF" w:sz="4"/>
+              <w:bottom w:val="single" w:color="BFBFBF" w:sz="4"/>
+              <w:right w:val="single" w:color="BFBFBF" w:sz="4"/>
+            </w:tcBorders>
+            <w:tcMar>
+              <w:top w:type="dxa" w:w="60"/>
+              <w:left w:type="dxa" w:w="100"/>
+              <w:bottom w:type="dxa" w:w="60"/>
+              <w:right w:type="dxa" w:w="100"/>
+            </w:tcMar>
+          </w:tcPr>
+          <w:p>
+            <w:pPr>
+              <w:spacing w:after="0"/>
+            </w:pPr>
+            <w:r>
+              <w:rPr>
+                <w:rFonts w:ascii="Calibri" w:cs="Calibri" w:eastAsia="Calibri" w:hAnsi="Calibri"/>
+                <w:sz w:val="19"/>
+                <w:szCs w:val="19"/>
+              </w:rPr>
+              <w:t xml:space="preserve">Saldo insuficiente en partida X</w:t>
+            </w:r>
+          </w:p>
+        </w:tc>
+        <w:tc>
+          <w:tcPr>
+            <w:tcW w:type="dxa" w:w="2792"/>
+            <w:tcBorders>
+              <w:top w:val="single" w:color="BFBFBF" w:sz="4"/>
+              <w:left w:val="single" w:color="BFBFBF" w:sz="4"/>
+              <w:bottom w:val="single" w:color="BFBFBF" w:sz="4"/>
+              <w:right w:val="single" w:color="BFBFBF" w:sz="4"/>
+            </w:tcBorders>
+            <w:tcMar>
+              <w:top w:type="dxa" w:w="60"/>
+              <w:left w:type="dxa" w:w="100"/>
+              <w:bottom w:type="dxa" w:w="60"/>
+              <w:right w:type="dxa" w:w="100"/>
+            </w:tcMar>
+          </w:tcPr>
+          <w:p>
+            <w:pPr>
+              <w:spacing w:after="0"/>
+            </w:pPr>
+            <w:r>
+              <w:rPr>
+                <w:rFonts w:ascii="Calibri" w:cs="Calibri" w:eastAsia="Calibri" w:hAnsi="Calibri"/>
+                <w:sz w:val="19"/>
+                <w:szCs w:val="19"/>
+              </w:rPr>
+              <w:t xml:space="preserve">La partida no alcanza</w:t>
+            </w:r>
+          </w:p>
+        </w:tc>
+        <w:tc>
+          <w:tcPr>
+            <w:tcW w:type="dxa" w:w="3284"/>
+            <w:tcBorders>
+              <w:top w:val="single" w:color="BFBFBF" w:sz="4"/>
+              <w:left w:val="single" w:color="BFBFBF" w:sz="4"/>
+              <w:bottom w:val="single" w:color="BFBFBF" w:sz="4"/>
+              <w:right w:val="single" w:color="BFBFBF" w:sz="4"/>
+            </w:tcBorders>
+            <w:tcMar>
+              <w:top w:type="dxa" w:w="60"/>
+              <w:left w:type="dxa" w:w="100"/>
+              <w:bottom w:type="dxa" w:w="60"/>
+              <w:right w:type="dxa" w:w="100"/>
+            </w:tcMar>
+          </w:tcPr>
+          <w:p>
+            <w:pPr>
+              <w:spacing w:after="0"/>
+            </w:pPr>
+            <w:r>
+              <w:rPr>
+                <w:rFonts w:ascii="Calibri" w:cs="Calibri" w:eastAsia="Calibri" w:hAnsi="Calibri"/>
+                <w:sz w:val="19"/>
+                <w:szCs w:val="19"/>
+              </w:rPr>
+              <w:t xml:space="preserve">Cambie la partida o gestione modificación presupuestaria</w:t>
             </w:r>
           </w:p>
         </w:tc>
@@ -10053,91 +10991,91 @@
         </w:trPr>
         <w:tc>
           <w:tcPr>
-            <w:tcW w:type="dxa" w:w="3600"/>
-            <w:tcBorders>
-              <w:top w:val="single" w:color="BFBFBF" w:sz="4"/>
-              <w:left w:val="single" w:color="BFBFBF" w:sz="4"/>
-              <w:bottom w:val="single" w:color="BFBFBF" w:sz="4"/>
-              <w:right w:val="single" w:color="BFBFBF" w:sz="4"/>
-            </w:tcBorders>
-            <w:tcMar>
-              <w:top w:type="dxa" w:w="60"/>
-              <w:left w:type="dxa" w:w="100"/>
-              <w:bottom w:type="dxa" w:w="60"/>
-              <w:right w:type="dxa" w:w="100"/>
-            </w:tcMar>
-          </w:tcPr>
-          <w:p>
-            <w:pPr>
-              <w:spacing w:after="0"/>
-            </w:pPr>
-            <w:r>
-              <w:rPr>
-                <w:rFonts w:ascii="Calibri" w:cs="Calibri" w:eastAsia="Calibri" w:hAnsi="Calibri"/>
-                <w:sz w:val="19"/>
-                <w:szCs w:val="19"/>
-              </w:rPr>
-              <w:t xml:space="preserve">El preventivo no cubre el monto cotizado</w:t>
-            </w:r>
-          </w:p>
-        </w:tc>
-        <w:tc>
-          <w:tcPr>
-            <w:tcW w:type="dxa" w:w="2400"/>
-            <w:tcBorders>
-              <w:top w:val="single" w:color="BFBFBF" w:sz="4"/>
-              <w:left w:val="single" w:color="BFBFBF" w:sz="4"/>
-              <w:bottom w:val="single" w:color="BFBFBF" w:sz="4"/>
-              <w:right w:val="single" w:color="BFBFBF" w:sz="4"/>
-            </w:tcBorders>
-            <w:tcMar>
-              <w:top w:type="dxa" w:w="60"/>
-              <w:left w:type="dxa" w:w="100"/>
-              <w:bottom w:type="dxa" w:w="60"/>
-              <w:right w:type="dxa" w:w="100"/>
-            </w:tcMar>
-          </w:tcPr>
-          <w:p>
-            <w:pPr>
-              <w:spacing w:after="0"/>
-            </w:pPr>
-            <w:r>
-              <w:rPr>
-                <w:rFonts w:ascii="Calibri" w:cs="Calibri" w:eastAsia="Calibri" w:hAnsi="Calibri"/>
-                <w:sz w:val="19"/>
-                <w:szCs w:val="19"/>
-              </w:rPr>
-              <w:t xml:space="preserve">La reserva es menor que la oferta</w:t>
-            </w:r>
-          </w:p>
-        </w:tc>
-        <w:tc>
-          <w:tcPr>
-            <w:tcW w:type="dxa" w:w="3360"/>
-            <w:tcBorders>
-              <w:top w:val="single" w:color="BFBFBF" w:sz="4"/>
-              <w:left w:val="single" w:color="BFBFBF" w:sz="4"/>
-              <w:bottom w:val="single" w:color="BFBFBF" w:sz="4"/>
-              <w:right w:val="single" w:color="BFBFBF" w:sz="4"/>
-            </w:tcBorders>
-            <w:tcMar>
-              <w:top w:type="dxa" w:w="60"/>
-              <w:left w:type="dxa" w:w="100"/>
-              <w:bottom w:type="dxa" w:w="60"/>
-              <w:right w:type="dxa" w:w="100"/>
-            </w:tcMar>
-          </w:tcPr>
-          <w:p>
-            <w:pPr>
-              <w:spacing w:after="0"/>
-            </w:pPr>
-            <w:r>
-              <w:rPr>
-                <w:rFonts w:ascii="Calibri" w:cs="Calibri" w:eastAsia="Calibri" w:hAnsi="Calibri"/>
-                <w:sz w:val="19"/>
-                <w:szCs w:val="19"/>
-              </w:rPr>
-              <w:t xml:space="preserve">PF revierte y emite otro por el monto correcto</w:t>
+            <w:tcW w:type="dxa" w:w="3284"/>
+            <w:tcBorders>
+              <w:top w:val="single" w:color="BFBFBF" w:sz="4"/>
+              <w:left w:val="single" w:color="BFBFBF" w:sz="4"/>
+              <w:bottom w:val="single" w:color="BFBFBF" w:sz="4"/>
+              <w:right w:val="single" w:color="BFBFBF" w:sz="4"/>
+            </w:tcBorders>
+            <w:tcMar>
+              <w:top w:type="dxa" w:w="60"/>
+              <w:left w:type="dxa" w:w="100"/>
+              <w:bottom w:type="dxa" w:w="60"/>
+              <w:right w:type="dxa" w:w="100"/>
+            </w:tcMar>
+          </w:tcPr>
+          <w:p>
+            <w:pPr>
+              <w:spacing w:after="0"/>
+            </w:pPr>
+            <w:r>
+              <w:rPr>
+                <w:rFonts w:ascii="Calibri" w:cs="Calibri" w:eastAsia="Calibri" w:hAnsi="Calibri"/>
+                <w:sz w:val="19"/>
+                <w:szCs w:val="19"/>
+              </w:rPr>
+              <w:t xml:space="preserve">La estructura programatica no existe en el presupuesto</w:t>
+            </w:r>
+          </w:p>
+        </w:tc>
+        <w:tc>
+          <w:tcPr>
+            <w:tcW w:type="dxa" w:w="2792"/>
+            <w:tcBorders>
+              <w:top w:val="single" w:color="BFBFBF" w:sz="4"/>
+              <w:left w:val="single" w:color="BFBFBF" w:sz="4"/>
+              <w:bottom w:val="single" w:color="BFBFBF" w:sz="4"/>
+              <w:right w:val="single" w:color="BFBFBF" w:sz="4"/>
+            </w:tcBorders>
+            <w:tcMar>
+              <w:top w:type="dxa" w:w="60"/>
+              <w:left w:type="dxa" w:w="100"/>
+              <w:bottom w:type="dxa" w:w="60"/>
+              <w:right w:type="dxa" w:w="100"/>
+            </w:tcMar>
+          </w:tcPr>
+          <w:p>
+            <w:pPr>
+              <w:spacing w:after="0"/>
+            </w:pPr>
+            <w:r>
+              <w:rPr>
+                <w:rFonts w:ascii="Calibri" w:cs="Calibri" w:eastAsia="Calibri" w:hAnsi="Calibri"/>
+                <w:sz w:val="19"/>
+                <w:szCs w:val="19"/>
+              </w:rPr>
+              <w:t xml:space="preserve">Algún código no coincide</w:t>
+            </w:r>
+          </w:p>
+        </w:tc>
+        <w:tc>
+          <w:tcPr>
+            <w:tcW w:type="dxa" w:w="3284"/>
+            <w:tcBorders>
+              <w:top w:val="single" w:color="BFBFBF" w:sz="4"/>
+              <w:left w:val="single" w:color="BFBFBF" w:sz="4"/>
+              <w:bottom w:val="single" w:color="BFBFBF" w:sz="4"/>
+              <w:right w:val="single" w:color="BFBFBF" w:sz="4"/>
+            </w:tcBorders>
+            <w:tcMar>
+              <w:top w:type="dxa" w:w="60"/>
+              <w:left w:type="dxa" w:w="100"/>
+              <w:bottom w:type="dxa" w:w="60"/>
+              <w:right w:type="dxa" w:w="100"/>
+            </w:tcMar>
+          </w:tcPr>
+          <w:p>
+            <w:pPr>
+              <w:spacing w:after="0"/>
+            </w:pPr>
+            <w:r>
+              <w:rPr>
+                <w:rFonts w:ascii="Calibri" w:cs="Calibri" w:eastAsia="Calibri" w:hAnsi="Calibri"/>
+                <w:sz w:val="19"/>
+                <w:szCs w:val="19"/>
+              </w:rPr>
+              <w:t xml:space="preserve">Revise los códigos con el presupuesto</w:t>
             </w:r>
           </w:p>
         </w:tc>
@@ -10148,91 +11086,91 @@
         </w:trPr>
         <w:tc>
           <w:tcPr>
-            <w:tcW w:type="dxa" w:w="3600"/>
-            <w:tcBorders>
-              <w:top w:val="single" w:color="BFBFBF" w:sz="4"/>
-              <w:left w:val="single" w:color="BFBFBF" w:sz="4"/>
-              <w:bottom w:val="single" w:color="BFBFBF" w:sz="4"/>
-              <w:right w:val="single" w:color="BFBFBF" w:sz="4"/>
-            </w:tcBorders>
-            <w:tcMar>
-              <w:top w:type="dxa" w:w="60"/>
-              <w:left w:type="dxa" w:w="100"/>
-              <w:bottom w:type="dxa" w:w="60"/>
-              <w:right w:type="dxa" w:w="100"/>
-            </w:tcMar>
-          </w:tcPr>
-          <w:p>
-            <w:pPr>
-              <w:spacing w:after="0"/>
-            </w:pPr>
-            <w:r>
-              <w:rPr>
-                <w:rFonts w:ascii="Calibri" w:cs="Calibri" w:eastAsia="Calibri" w:hAnsi="Calibri"/>
-                <w:sz w:val="19"/>
-                <w:szCs w:val="19"/>
-              </w:rPr>
-              <w:t xml:space="preserve">Asocie primero el N de C-31 aprobado en SIGEP</w:t>
-            </w:r>
-          </w:p>
-        </w:tc>
-        <w:tc>
-          <w:tcPr>
-            <w:tcW w:type="dxa" w:w="2400"/>
-            <w:tcBorders>
-              <w:top w:val="single" w:color="BFBFBF" w:sz="4"/>
-              <w:left w:val="single" w:color="BFBFBF" w:sz="4"/>
-              <w:bottom w:val="single" w:color="BFBFBF" w:sz="4"/>
-              <w:right w:val="single" w:color="BFBFBF" w:sz="4"/>
-            </w:tcBorders>
-            <w:tcMar>
-              <w:top w:type="dxa" w:w="60"/>
-              <w:left w:type="dxa" w:w="100"/>
-              <w:bottom w:type="dxa" w:w="60"/>
-              <w:right w:type="dxa" w:w="100"/>
-            </w:tcMar>
-          </w:tcPr>
-          <w:p>
-            <w:pPr>
-              <w:spacing w:after="0"/>
-            </w:pPr>
-            <w:r>
-              <w:rPr>
-                <w:rFonts w:ascii="Calibri" w:cs="Calibri" w:eastAsia="Calibri" w:hAnsi="Calibri"/>
-                <w:sz w:val="19"/>
-                <w:szCs w:val="19"/>
-              </w:rPr>
-              <w:t xml:space="preserve">Falta asociar el número SIGEP</w:t>
-            </w:r>
-          </w:p>
-        </w:tc>
-        <w:tc>
-          <w:tcPr>
-            <w:tcW w:type="dxa" w:w="3360"/>
-            <w:tcBorders>
-              <w:top w:val="single" w:color="BFBFBF" w:sz="4"/>
-              <w:left w:val="single" w:color="BFBFBF" w:sz="4"/>
-              <w:bottom w:val="single" w:color="BFBFBF" w:sz="4"/>
-              <w:right w:val="single" w:color="BFBFBF" w:sz="4"/>
-            </w:tcBorders>
-            <w:tcMar>
-              <w:top w:type="dxa" w:w="60"/>
-              <w:left w:type="dxa" w:w="100"/>
-              <w:bottom w:type="dxa" w:w="60"/>
-              <w:right w:type="dxa" w:w="100"/>
-            </w:tcMar>
-          </w:tcPr>
-          <w:p>
-            <w:pPr>
-              <w:spacing w:after="0"/>
-            </w:pPr>
-            <w:r>
-              <w:rPr>
-                <w:rFonts w:ascii="Calibri" w:cs="Calibri" w:eastAsia="Calibri" w:hAnsi="Calibri"/>
-                <w:sz w:val="19"/>
-                <w:szCs w:val="19"/>
-              </w:rPr>
-              <w:t xml:space="preserve">PF lo asocia (sección 8.2)</w:t>
+            <w:tcW w:type="dxa" w:w="3284"/>
+            <w:tcBorders>
+              <w:top w:val="single" w:color="BFBFBF" w:sz="4"/>
+              <w:left w:val="single" w:color="BFBFBF" w:sz="4"/>
+              <w:bottom w:val="single" w:color="BFBFBF" w:sz="4"/>
+              <w:right w:val="single" w:color="BFBFBF" w:sz="4"/>
+            </w:tcBorders>
+            <w:tcMar>
+              <w:top w:type="dxa" w:w="60"/>
+              <w:left w:type="dxa" w:w="100"/>
+              <w:bottom w:type="dxa" w:w="60"/>
+              <w:right w:type="dxa" w:w="100"/>
+            </w:tcMar>
+          </w:tcPr>
+          <w:p>
+            <w:pPr>
+              <w:spacing w:after="0"/>
+            </w:pPr>
+            <w:r>
+              <w:rPr>
+                <w:rFonts w:ascii="Calibri" w:cs="Calibri" w:eastAsia="Calibri" w:hAnsi="Calibri"/>
+                <w:sz w:val="19"/>
+                <w:szCs w:val="19"/>
+              </w:rPr>
+              <w:t xml:space="preserve">El preventivo no cubre el monto cotizado</w:t>
+            </w:r>
+          </w:p>
+        </w:tc>
+        <w:tc>
+          <w:tcPr>
+            <w:tcW w:type="dxa" w:w="2792"/>
+            <w:tcBorders>
+              <w:top w:val="single" w:color="BFBFBF" w:sz="4"/>
+              <w:left w:val="single" w:color="BFBFBF" w:sz="4"/>
+              <w:bottom w:val="single" w:color="BFBFBF" w:sz="4"/>
+              <w:right w:val="single" w:color="BFBFBF" w:sz="4"/>
+            </w:tcBorders>
+            <w:tcMar>
+              <w:top w:type="dxa" w:w="60"/>
+              <w:left w:type="dxa" w:w="100"/>
+              <w:bottom w:type="dxa" w:w="60"/>
+              <w:right w:type="dxa" w:w="100"/>
+            </w:tcMar>
+          </w:tcPr>
+          <w:p>
+            <w:pPr>
+              <w:spacing w:after="0"/>
+            </w:pPr>
+            <w:r>
+              <w:rPr>
+                <w:rFonts w:ascii="Calibri" w:cs="Calibri" w:eastAsia="Calibri" w:hAnsi="Calibri"/>
+                <w:sz w:val="19"/>
+                <w:szCs w:val="19"/>
+              </w:rPr>
+              <w:t xml:space="preserve">La reserva es menor que la oferta</w:t>
+            </w:r>
+          </w:p>
+        </w:tc>
+        <w:tc>
+          <w:tcPr>
+            <w:tcW w:type="dxa" w:w="3284"/>
+            <w:tcBorders>
+              <w:top w:val="single" w:color="BFBFBF" w:sz="4"/>
+              <w:left w:val="single" w:color="BFBFBF" w:sz="4"/>
+              <w:bottom w:val="single" w:color="BFBFBF" w:sz="4"/>
+              <w:right w:val="single" w:color="BFBFBF" w:sz="4"/>
+            </w:tcBorders>
+            <w:tcMar>
+              <w:top w:type="dxa" w:w="60"/>
+              <w:left w:type="dxa" w:w="100"/>
+              <w:bottom w:type="dxa" w:w="60"/>
+              <w:right w:type="dxa" w:w="100"/>
+            </w:tcMar>
+          </w:tcPr>
+          <w:p>
+            <w:pPr>
+              <w:spacing w:after="0"/>
+            </w:pPr>
+            <w:r>
+              <w:rPr>
+                <w:rFonts w:ascii="Calibri" w:cs="Calibri" w:eastAsia="Calibri" w:hAnsi="Calibri"/>
+                <w:sz w:val="19"/>
+                <w:szCs w:val="19"/>
+              </w:rPr>
+              <w:t xml:space="preserve">PF revierte y emite otro por el monto correcto</w:t>
             </w:r>
           </w:p>
         </w:tc>
@@ -10243,91 +11181,91 @@
         </w:trPr>
         <w:tc>
           <w:tcPr>
-            <w:tcW w:type="dxa" w:w="3600"/>
-            <w:tcBorders>
-              <w:top w:val="single" w:color="BFBFBF" w:sz="4"/>
-              <w:left w:val="single" w:color="BFBFBF" w:sz="4"/>
-              <w:bottom w:val="single" w:color="BFBFBF" w:sz="4"/>
-              <w:right w:val="single" w:color="BFBFBF" w:sz="4"/>
-            </w:tcBorders>
-            <w:tcMar>
-              <w:top w:type="dxa" w:w="60"/>
-              <w:left w:type="dxa" w:w="100"/>
-              <w:bottom w:type="dxa" w:w="60"/>
-              <w:right w:type="dxa" w:w="100"/>
-            </w:tcMar>
-          </w:tcPr>
-          <w:p>
-            <w:pPr>
-              <w:spacing w:after="0"/>
-            </w:pPr>
-            <w:r>
-              <w:rPr>
-                <w:rFonts w:ascii="Calibri" w:cs="Calibri" w:eastAsia="Calibri" w:hAnsi="Calibri"/>
-                <w:sz w:val="19"/>
-                <w:szCs w:val="19"/>
-              </w:rPr>
-              <w:t xml:space="preserve">Existe una Orden emitida con cargo a este preventivo</w:t>
-            </w:r>
-          </w:p>
-        </w:tc>
-        <w:tc>
-          <w:tcPr>
-            <w:tcW w:type="dxa" w:w="2400"/>
-            <w:tcBorders>
-              <w:top w:val="single" w:color="BFBFBF" w:sz="4"/>
-              <w:left w:val="single" w:color="BFBFBF" w:sz="4"/>
-              <w:bottom w:val="single" w:color="BFBFBF" w:sz="4"/>
-              <w:right w:val="single" w:color="BFBFBF" w:sz="4"/>
-            </w:tcBorders>
-            <w:tcMar>
-              <w:top w:type="dxa" w:w="60"/>
-              <w:left w:type="dxa" w:w="100"/>
-              <w:bottom w:type="dxa" w:w="60"/>
-              <w:right w:type="dxa" w:w="100"/>
-            </w:tcMar>
-          </w:tcPr>
-          <w:p>
-            <w:pPr>
-              <w:spacing w:after="0"/>
-            </w:pPr>
-            <w:r>
-              <w:rPr>
-                <w:rFonts w:ascii="Calibri" w:cs="Calibri" w:eastAsia="Calibri" w:hAnsi="Calibri"/>
-                <w:sz w:val="19"/>
-                <w:szCs w:val="19"/>
-              </w:rPr>
-              <w:t xml:space="preserve">Intenta revertir con Orden vigente</w:t>
-            </w:r>
-          </w:p>
-        </w:tc>
-        <w:tc>
-          <w:tcPr>
-            <w:tcW w:type="dxa" w:w="3360"/>
-            <w:tcBorders>
-              <w:top w:val="single" w:color="BFBFBF" w:sz="4"/>
-              <w:left w:val="single" w:color="BFBFBF" w:sz="4"/>
-              <w:bottom w:val="single" w:color="BFBFBF" w:sz="4"/>
-              <w:right w:val="single" w:color="BFBFBF" w:sz="4"/>
-            </w:tcBorders>
-            <w:tcMar>
-              <w:top w:type="dxa" w:w="60"/>
-              <w:left w:type="dxa" w:w="100"/>
-              <w:bottom w:type="dxa" w:w="60"/>
-              <w:right w:type="dxa" w:w="100"/>
-            </w:tcMar>
-          </w:tcPr>
-          <w:p>
-            <w:pPr>
-              <w:spacing w:after="0"/>
-            </w:pPr>
-            <w:r>
-              <w:rPr>
-                <w:rFonts w:ascii="Calibri" w:cs="Calibri" w:eastAsia="Calibri" w:hAnsi="Calibri"/>
-                <w:sz w:val="19"/>
-                <w:szCs w:val="19"/>
-              </w:rPr>
-              <w:t xml:space="preserve">Anule primero la Orden</w:t>
+            <w:tcW w:type="dxa" w:w="3284"/>
+            <w:tcBorders>
+              <w:top w:val="single" w:color="BFBFBF" w:sz="4"/>
+              <w:left w:val="single" w:color="BFBFBF" w:sz="4"/>
+              <w:bottom w:val="single" w:color="BFBFBF" w:sz="4"/>
+              <w:right w:val="single" w:color="BFBFBF" w:sz="4"/>
+            </w:tcBorders>
+            <w:tcMar>
+              <w:top w:type="dxa" w:w="60"/>
+              <w:left w:type="dxa" w:w="100"/>
+              <w:bottom w:type="dxa" w:w="60"/>
+              <w:right w:type="dxa" w:w="100"/>
+            </w:tcMar>
+          </w:tcPr>
+          <w:p>
+            <w:pPr>
+              <w:spacing w:after="0"/>
+            </w:pPr>
+            <w:r>
+              <w:rPr>
+                <w:rFonts w:ascii="Calibri" w:cs="Calibri" w:eastAsia="Calibri" w:hAnsi="Calibri"/>
+                <w:sz w:val="19"/>
+                <w:szCs w:val="19"/>
+              </w:rPr>
+              <w:t xml:space="preserve">Asocie primero el N de C-31 aprobado en SIGEP</w:t>
+            </w:r>
+          </w:p>
+        </w:tc>
+        <w:tc>
+          <w:tcPr>
+            <w:tcW w:type="dxa" w:w="2792"/>
+            <w:tcBorders>
+              <w:top w:val="single" w:color="BFBFBF" w:sz="4"/>
+              <w:left w:val="single" w:color="BFBFBF" w:sz="4"/>
+              <w:bottom w:val="single" w:color="BFBFBF" w:sz="4"/>
+              <w:right w:val="single" w:color="BFBFBF" w:sz="4"/>
+            </w:tcBorders>
+            <w:tcMar>
+              <w:top w:type="dxa" w:w="60"/>
+              <w:left w:type="dxa" w:w="100"/>
+              <w:bottom w:type="dxa" w:w="60"/>
+              <w:right w:type="dxa" w:w="100"/>
+            </w:tcMar>
+          </w:tcPr>
+          <w:p>
+            <w:pPr>
+              <w:spacing w:after="0"/>
+            </w:pPr>
+            <w:r>
+              <w:rPr>
+                <w:rFonts w:ascii="Calibri" w:cs="Calibri" w:eastAsia="Calibri" w:hAnsi="Calibri"/>
+                <w:sz w:val="19"/>
+                <w:szCs w:val="19"/>
+              </w:rPr>
+              <w:t xml:space="preserve">Falta asociar el número SIGEP</w:t>
+            </w:r>
+          </w:p>
+        </w:tc>
+        <w:tc>
+          <w:tcPr>
+            <w:tcW w:type="dxa" w:w="3284"/>
+            <w:tcBorders>
+              <w:top w:val="single" w:color="BFBFBF" w:sz="4"/>
+              <w:left w:val="single" w:color="BFBFBF" w:sz="4"/>
+              <w:bottom w:val="single" w:color="BFBFBF" w:sz="4"/>
+              <w:right w:val="single" w:color="BFBFBF" w:sz="4"/>
+            </w:tcBorders>
+            <w:tcMar>
+              <w:top w:type="dxa" w:w="60"/>
+              <w:left w:type="dxa" w:w="100"/>
+              <w:bottom w:type="dxa" w:w="60"/>
+              <w:right w:type="dxa" w:w="100"/>
+            </w:tcMar>
+          </w:tcPr>
+          <w:p>
+            <w:pPr>
+              <w:spacing w:after="0"/>
+            </w:pPr>
+            <w:r>
+              <w:rPr>
+                <w:rFonts w:ascii="Calibri" w:cs="Calibri" w:eastAsia="Calibri" w:hAnsi="Calibri"/>
+                <w:sz w:val="19"/>
+                <w:szCs w:val="19"/>
+              </w:rPr>
+              <w:t xml:space="preserve">PF lo asocia (sección 8.2)</w:t>
             </w:r>
           </w:p>
         </w:tc>
@@ -10338,91 +11276,91 @@
         </w:trPr>
         <w:tc>
           <w:tcPr>
-            <w:tcW w:type="dxa" w:w="3600"/>
-            <w:tcBorders>
-              <w:top w:val="single" w:color="BFBFBF" w:sz="4"/>
-              <w:left w:val="single" w:color="BFBFBF" w:sz="4"/>
-              <w:bottom w:val="single" w:color="BFBFBF" w:sz="4"/>
-              <w:right w:val="single" w:color="BFBFBF" w:sz="4"/>
-            </w:tcBorders>
-            <w:tcMar>
-              <w:top w:type="dxa" w:w="60"/>
-              <w:left w:type="dxa" w:w="100"/>
-              <w:bottom w:type="dxa" w:w="60"/>
-              <w:right w:type="dxa" w:w="100"/>
-            </w:tcMar>
-          </w:tcPr>
-          <w:p>
-            <w:pPr>
-              <w:spacing w:after="0"/>
-            </w:pPr>
-            <w:r>
-              <w:rPr>
-                <w:rFonts w:ascii="Calibri" w:cs="Calibri" w:eastAsia="Calibri" w:hAnsi="Calibri"/>
-                <w:sz w:val="19"/>
-                <w:szCs w:val="19"/>
-              </w:rPr>
-              <w:t xml:space="preserve">Solo puede adjudicarse la oferta recomendada</w:t>
-            </w:r>
-          </w:p>
-        </w:tc>
-        <w:tc>
-          <w:tcPr>
-            <w:tcW w:type="dxa" w:w="2400"/>
-            <w:tcBorders>
-              <w:top w:val="single" w:color="BFBFBF" w:sz="4"/>
-              <w:left w:val="single" w:color="BFBFBF" w:sz="4"/>
-              <w:bottom w:val="single" w:color="BFBFBF" w:sz="4"/>
-              <w:right w:val="single" w:color="BFBFBF" w:sz="4"/>
-            </w:tcBorders>
-            <w:tcMar>
-              <w:top w:type="dxa" w:w="60"/>
-              <w:left w:type="dxa" w:w="100"/>
-              <w:bottom w:type="dxa" w:w="60"/>
-              <w:right w:type="dxa" w:w="100"/>
-            </w:tcMar>
-          </w:tcPr>
-          <w:p>
-            <w:pPr>
-              <w:spacing w:after="0"/>
-            </w:pPr>
-            <w:r>
-              <w:rPr>
-                <w:rFonts w:ascii="Calibri" w:cs="Calibri" w:eastAsia="Calibri" w:hAnsi="Calibri"/>
-                <w:sz w:val="19"/>
-                <w:szCs w:val="19"/>
-              </w:rPr>
-              <w:t xml:space="preserve">Seleccionó otra oferta</w:t>
-            </w:r>
-          </w:p>
-        </w:tc>
-        <w:tc>
-          <w:tcPr>
-            <w:tcW w:type="dxa" w:w="3360"/>
-            <w:tcBorders>
-              <w:top w:val="single" w:color="BFBFBF" w:sz="4"/>
-              <w:left w:val="single" w:color="BFBFBF" w:sz="4"/>
-              <w:bottom w:val="single" w:color="BFBFBF" w:sz="4"/>
-              <w:right w:val="single" w:color="BFBFBF" w:sz="4"/>
-            </w:tcBorders>
-            <w:tcMar>
-              <w:top w:type="dxa" w:w="60"/>
-              <w:left w:type="dxa" w:w="100"/>
-              <w:bottom w:type="dxa" w:w="60"/>
-              <w:right w:type="dxa" w:w="100"/>
-            </w:tcMar>
-          </w:tcPr>
-          <w:p>
-            <w:pPr>
-              <w:spacing w:after="0"/>
-            </w:pPr>
-            <w:r>
-              <w:rPr>
-                <w:rFonts w:ascii="Calibri" w:cs="Calibri" w:eastAsia="Calibri" w:hAnsi="Calibri"/>
-                <w:sz w:val="19"/>
-                <w:szCs w:val="19"/>
-              </w:rPr>
-              <w:t xml:space="preserve">Seleccione la recomendada</w:t>
+            <w:tcW w:type="dxa" w:w="3284"/>
+            <w:tcBorders>
+              <w:top w:val="single" w:color="BFBFBF" w:sz="4"/>
+              <w:left w:val="single" w:color="BFBFBF" w:sz="4"/>
+              <w:bottom w:val="single" w:color="BFBFBF" w:sz="4"/>
+              <w:right w:val="single" w:color="BFBFBF" w:sz="4"/>
+            </w:tcBorders>
+            <w:tcMar>
+              <w:top w:type="dxa" w:w="60"/>
+              <w:left w:type="dxa" w:w="100"/>
+              <w:bottom w:type="dxa" w:w="60"/>
+              <w:right w:type="dxa" w:w="100"/>
+            </w:tcMar>
+          </w:tcPr>
+          <w:p>
+            <w:pPr>
+              <w:spacing w:after="0"/>
+            </w:pPr>
+            <w:r>
+              <w:rPr>
+                <w:rFonts w:ascii="Calibri" w:cs="Calibri" w:eastAsia="Calibri" w:hAnsi="Calibri"/>
+                <w:sz w:val="19"/>
+                <w:szCs w:val="19"/>
+              </w:rPr>
+              <w:t xml:space="preserve">Existe una Orden emitida con cargo a este preventivo</w:t>
+            </w:r>
+          </w:p>
+        </w:tc>
+        <w:tc>
+          <w:tcPr>
+            <w:tcW w:type="dxa" w:w="2792"/>
+            <w:tcBorders>
+              <w:top w:val="single" w:color="BFBFBF" w:sz="4"/>
+              <w:left w:val="single" w:color="BFBFBF" w:sz="4"/>
+              <w:bottom w:val="single" w:color="BFBFBF" w:sz="4"/>
+              <w:right w:val="single" w:color="BFBFBF" w:sz="4"/>
+            </w:tcBorders>
+            <w:tcMar>
+              <w:top w:type="dxa" w:w="60"/>
+              <w:left w:type="dxa" w:w="100"/>
+              <w:bottom w:type="dxa" w:w="60"/>
+              <w:right w:type="dxa" w:w="100"/>
+            </w:tcMar>
+          </w:tcPr>
+          <w:p>
+            <w:pPr>
+              <w:spacing w:after="0"/>
+            </w:pPr>
+            <w:r>
+              <w:rPr>
+                <w:rFonts w:ascii="Calibri" w:cs="Calibri" w:eastAsia="Calibri" w:hAnsi="Calibri"/>
+                <w:sz w:val="19"/>
+                <w:szCs w:val="19"/>
+              </w:rPr>
+              <w:t xml:space="preserve">Intenta revertir con Orden vigente</w:t>
+            </w:r>
+          </w:p>
+        </w:tc>
+        <w:tc>
+          <w:tcPr>
+            <w:tcW w:type="dxa" w:w="3284"/>
+            <w:tcBorders>
+              <w:top w:val="single" w:color="BFBFBF" w:sz="4"/>
+              <w:left w:val="single" w:color="BFBFBF" w:sz="4"/>
+              <w:bottom w:val="single" w:color="BFBFBF" w:sz="4"/>
+              <w:right w:val="single" w:color="BFBFBF" w:sz="4"/>
+            </w:tcBorders>
+            <w:tcMar>
+              <w:top w:type="dxa" w:w="60"/>
+              <w:left w:type="dxa" w:w="100"/>
+              <w:bottom w:type="dxa" w:w="60"/>
+              <w:right w:type="dxa" w:w="100"/>
+            </w:tcMar>
+          </w:tcPr>
+          <w:p>
+            <w:pPr>
+              <w:spacing w:after="0"/>
+            </w:pPr>
+            <w:r>
+              <w:rPr>
+                <w:rFonts w:ascii="Calibri" w:cs="Calibri" w:eastAsia="Calibri" w:hAnsi="Calibri"/>
+                <w:sz w:val="19"/>
+                <w:szCs w:val="19"/>
+              </w:rPr>
+              <w:t xml:space="preserve">Anule primero la Orden</w:t>
             </w:r>
           </w:p>
         </w:tc>
@@ -10433,7 +11371,102 @@
         </w:trPr>
         <w:tc>
           <w:tcPr>
-            <w:tcW w:type="dxa" w:w="3600"/>
+            <w:tcW w:type="dxa" w:w="3284"/>
+            <w:tcBorders>
+              <w:top w:val="single" w:color="BFBFBF" w:sz="4"/>
+              <w:left w:val="single" w:color="BFBFBF" w:sz="4"/>
+              <w:bottom w:val="single" w:color="BFBFBF" w:sz="4"/>
+              <w:right w:val="single" w:color="BFBFBF" w:sz="4"/>
+            </w:tcBorders>
+            <w:tcMar>
+              <w:top w:type="dxa" w:w="60"/>
+              <w:left w:type="dxa" w:w="100"/>
+              <w:bottom w:type="dxa" w:w="60"/>
+              <w:right w:type="dxa" w:w="100"/>
+            </w:tcMar>
+          </w:tcPr>
+          <w:p>
+            <w:pPr>
+              <w:spacing w:after="0"/>
+            </w:pPr>
+            <w:r>
+              <w:rPr>
+                <w:rFonts w:ascii="Calibri" w:cs="Calibri" w:eastAsia="Calibri" w:hAnsi="Calibri"/>
+                <w:sz w:val="19"/>
+                <w:szCs w:val="19"/>
+              </w:rPr>
+              <w:t xml:space="preserve">Solo puede adjudicarse la oferta recomendada</w:t>
+            </w:r>
+          </w:p>
+        </w:tc>
+        <w:tc>
+          <w:tcPr>
+            <w:tcW w:type="dxa" w:w="2792"/>
+            <w:tcBorders>
+              <w:top w:val="single" w:color="BFBFBF" w:sz="4"/>
+              <w:left w:val="single" w:color="BFBFBF" w:sz="4"/>
+              <w:bottom w:val="single" w:color="BFBFBF" w:sz="4"/>
+              <w:right w:val="single" w:color="BFBFBF" w:sz="4"/>
+            </w:tcBorders>
+            <w:tcMar>
+              <w:top w:type="dxa" w:w="60"/>
+              <w:left w:type="dxa" w:w="100"/>
+              <w:bottom w:type="dxa" w:w="60"/>
+              <w:right w:type="dxa" w:w="100"/>
+            </w:tcMar>
+          </w:tcPr>
+          <w:p>
+            <w:pPr>
+              <w:spacing w:after="0"/>
+            </w:pPr>
+            <w:r>
+              <w:rPr>
+                <w:rFonts w:ascii="Calibri" w:cs="Calibri" w:eastAsia="Calibri" w:hAnsi="Calibri"/>
+                <w:sz w:val="19"/>
+                <w:szCs w:val="19"/>
+              </w:rPr>
+              <w:t xml:space="preserve">Seleccionó otra oferta</w:t>
+            </w:r>
+          </w:p>
+        </w:tc>
+        <w:tc>
+          <w:tcPr>
+            <w:tcW w:type="dxa" w:w="3284"/>
+            <w:tcBorders>
+              <w:top w:val="single" w:color="BFBFBF" w:sz="4"/>
+              <w:left w:val="single" w:color="BFBFBF" w:sz="4"/>
+              <w:bottom w:val="single" w:color="BFBFBF" w:sz="4"/>
+              <w:right w:val="single" w:color="BFBFBF" w:sz="4"/>
+            </w:tcBorders>
+            <w:tcMar>
+              <w:top w:type="dxa" w:w="60"/>
+              <w:left w:type="dxa" w:w="100"/>
+              <w:bottom w:type="dxa" w:w="60"/>
+              <w:right w:type="dxa" w:w="100"/>
+            </w:tcMar>
+          </w:tcPr>
+          <w:p>
+            <w:pPr>
+              <w:spacing w:after="0"/>
+            </w:pPr>
+            <w:r>
+              <w:rPr>
+                <w:rFonts w:ascii="Calibri" w:cs="Calibri" w:eastAsia="Calibri" w:hAnsi="Calibri"/>
+                <w:sz w:val="19"/>
+                <w:szCs w:val="19"/>
+              </w:rPr>
+              <w:t xml:space="preserve">Seleccione la recomendada</w:t>
+            </w:r>
+          </w:p>
+        </w:tc>
+      </w:tr>
+      <w:tr>
+        <w:trPr>
+          <w:cantSplit/>
+        </w:trPr>
+        <w:tc>
+          <w:tcPr>
+            <w:tcW w:type="dxa" w:w="3284"/>
             <w:tcBorders>
               <w:top w:val="single" w:color="BFBFBF" w:sz="4"/>
               <w:left w:val="single" w:color="BFBFBF" w:sz="4"/>
@@ -10463,7 +11496,7 @@
         </w:tc>
         <w:tc>
           <w:tcPr>
-            <w:tcW w:type="dxa" w:w="2400"/>
+            <w:tcW w:type="dxa" w:w="2792"/>
             <w:tcBorders>
               <w:top w:val="single" w:color="BFBFBF" w:sz="4"/>
               <w:left w:val="single" w:color="BFBFBF" w:sz="4"/>
@@ -10493,7 +11526,7 @@
         </w:tc>
         <w:tc>
           <w:tcPr>
-            <w:tcW w:type="dxa" w:w="3360"/>
+            <w:tcW w:type="dxa" w:w="3284"/>
             <w:tcBorders>
               <w:top w:val="single" w:color="BFBFBF" w:sz="4"/>
               <w:left w:val="single" w:color="BFBFBF" w:sz="4"/>
@@ -10624,6 +11657,25 @@
           <w:rFonts w:ascii="Calibri" w:cs="Calibri" w:eastAsia="Calibri" w:hAnsi="Calibri"/>
         </w:rPr>
         <w:t xml:space="preserve">.</w:t>
+      </w:r>
+    </w:p>
+    <w:p>
+      <w:pPr>
+        <w:spacing w:after="140"/>
+      </w:pPr>
+      <w:r>
+        <w:rPr>
+          <w:rFonts w:ascii="Calibri" w:cs="Calibri" w:eastAsia="Calibri" w:hAnsi="Calibri"/>
+          <w:b/>
+          <w:bCs/>
+        </w:rPr>
+        <w:t xml:space="preserve">¿Qué pasa si dos ofertas cotizan lo mismo?</w:t>
+      </w:r>
+      <w:r>
+        <w:rPr>
+          <w:rFonts w:ascii="Calibri" w:cs="Calibri" w:eastAsia="Calibri" w:hAnsi="Calibri"/>
+        </w:rPr>
+        <w:t xml:space="preserve"> Se recomienda la que se recibió primero (por fecha y hora de recepción). Es una regla del sistema; confirme con su Asesoría Legal que sea la que fija la invitación a cotizar.</w:t>
       </w:r>
     </w:p>
     <w:p>

</xml_diff>